<commit_message>
Enhance admin stats and zone deactivation error messages
</commit_message>
<xml_diff>
--- a/FA24-BSE-A-118,076 Smart_Parking_DB.docx
+++ b/FA24-BSE-A-118,076 Smart_Parking_DB.docx
@@ -349,9 +349,9 @@
             </w:pPr>
             <w:bookmarkStart w:id="5" w:name="_Toc228752425"/>
             <w:bookmarkStart w:id="6" w:name="_Toc229144951"/>
-            <w:bookmarkStart w:id="7" w:name="_Toc229261679"/>
-            <w:bookmarkStart w:id="8" w:name="_Toc228739432"/>
-            <w:bookmarkStart w:id="9" w:name="_Toc228739808"/>
+            <w:bookmarkStart w:id="7" w:name="_Toc228739432"/>
+            <w:bookmarkStart w:id="8" w:name="_Toc228739808"/>
+            <w:bookmarkStart w:id="9" w:name="_Toc229261679"/>
             <w:r>
               <w:rPr>
                 <w:rStyle w:val="SubtleEmphasis"/>
@@ -363,7 +363,7 @@
             </w:r>
             <w:bookmarkEnd w:id="5"/>
             <w:bookmarkEnd w:id="6"/>
-            <w:bookmarkEnd w:id="7"/>
+            <w:bookmarkEnd w:id="9"/>
           </w:p>
           <w:p>
             <w:pPr>
@@ -388,8 +388,8 @@
               </w:rPr>
               <w:t>(FA24-BSE-118)</w:t>
             </w:r>
+            <w:bookmarkEnd w:id="7"/>
             <w:bookmarkEnd w:id="8"/>
-            <w:bookmarkEnd w:id="9"/>
             <w:bookmarkEnd w:id="10"/>
             <w:bookmarkEnd w:id="11"/>
             <w:bookmarkEnd w:id="12"/>
@@ -407,9 +407,9 @@
             </w:pPr>
             <w:bookmarkStart w:id="13" w:name="_Toc228752427"/>
             <w:bookmarkStart w:id="14" w:name="_Toc229144953"/>
-            <w:bookmarkStart w:id="15" w:name="_Toc229261681"/>
-            <w:bookmarkStart w:id="16" w:name="_Toc228739433"/>
-            <w:bookmarkStart w:id="17" w:name="_Toc228739809"/>
+            <w:bookmarkStart w:id="15" w:name="_Toc228739433"/>
+            <w:bookmarkStart w:id="16" w:name="_Toc228739809"/>
+            <w:bookmarkStart w:id="17" w:name="_Toc229261681"/>
             <w:r>
               <w:rPr>
                 <w:rStyle w:val="SubtleEmphasis"/>
@@ -421,7 +421,7 @@
             </w:r>
             <w:bookmarkEnd w:id="13"/>
             <w:bookmarkEnd w:id="14"/>
-            <w:bookmarkEnd w:id="15"/>
+            <w:bookmarkEnd w:id="17"/>
           </w:p>
           <w:p>
             <w:pPr>
@@ -446,8 +446,8 @@
               </w:rPr>
               <w:t>(FA24-BSE-076)</w:t>
             </w:r>
+            <w:bookmarkEnd w:id="15"/>
             <w:bookmarkEnd w:id="16"/>
-            <w:bookmarkEnd w:id="17"/>
             <w:bookmarkEnd w:id="18"/>
             <w:bookmarkEnd w:id="19"/>
             <w:bookmarkEnd w:id="20"/>
@@ -882,6 +882,7 @@
               <w:rFonts w:asciiTheme="minorHAnsi" w:eastAsiaTheme="minorEastAsia" w:hAnsiTheme="minorHAnsi" w:cstheme="minorBidi"/>
               <w:noProof/>
               <w:kern w:val="2"/>
+              <w:lang w:val="en-PK" w:eastAsia="en-PK"/>
               <w14:ligatures w14:val="standardContextual"/>
             </w:rPr>
           </w:pPr>
@@ -911,6 +912,7 @@
               <w:kern w:val="2"/>
               <w:sz w:val="28"/>
               <w:szCs w:val="28"/>
+              <w:lang w:val="en-PK" w:eastAsia="en-PK"/>
               <w14:ligatures w14:val="standardContextual"/>
             </w:rPr>
           </w:pPr>
@@ -927,7 +929,35 @@
                 <w:sz w:val="28"/>
                 <w:szCs w:val="28"/>
               </w:rPr>
-              <w:t>1. Abstract</w:t>
+              <w:t>1. Abstr</w:t>
+            </w:r>
+            <w:r>
+              <w:rPr>
+                <w:rStyle w:val="Hyperlink"/>
+                <w:rFonts w:ascii="ADLaM Display" w:hAnsi="ADLaM Display" w:cs="ADLaM Display"/>
+                <w:b/>
+                <w:bCs/>
+                <w:i/>
+                <w:iCs/>
+                <w:noProof/>
+                <w:sz w:val="28"/>
+                <w:szCs w:val="28"/>
+              </w:rPr>
+              <w:t>a</w:t>
+            </w:r>
+            <w:r>
+              <w:rPr>
+                <w:rStyle w:val="Hyperlink"/>
+                <w:rFonts w:ascii="ADLaM Display" w:hAnsi="ADLaM Display" w:cs="ADLaM Display"/>
+                <w:b/>
+                <w:bCs/>
+                <w:i/>
+                <w:iCs/>
+                <w:noProof/>
+                <w:sz w:val="28"/>
+                <w:szCs w:val="28"/>
+              </w:rPr>
+              <w:t>ct</w:t>
             </w:r>
             <w:r>
               <w:rPr>
@@ -1037,6 +1067,7 @@
               <w:kern w:val="2"/>
               <w:sz w:val="28"/>
               <w:szCs w:val="28"/>
+              <w:lang w:val="en-PK" w:eastAsia="en-PK"/>
               <w14:ligatures w14:val="standardContextual"/>
             </w:rPr>
           </w:pPr>
@@ -1053,7 +1084,35 @@
                 <w:sz w:val="28"/>
                 <w:szCs w:val="28"/>
               </w:rPr>
-              <w:t>2. Introduction</w:t>
+              <w:t>2. Intr</w:t>
+            </w:r>
+            <w:r>
+              <w:rPr>
+                <w:rStyle w:val="Hyperlink"/>
+                <w:rFonts w:ascii="ADLaM Display" w:hAnsi="ADLaM Display" w:cs="ADLaM Display"/>
+                <w:b/>
+                <w:bCs/>
+                <w:i/>
+                <w:iCs/>
+                <w:noProof/>
+                <w:sz w:val="28"/>
+                <w:szCs w:val="28"/>
+              </w:rPr>
+              <w:t>o</w:t>
+            </w:r>
+            <w:r>
+              <w:rPr>
+                <w:rStyle w:val="Hyperlink"/>
+                <w:rFonts w:ascii="ADLaM Display" w:hAnsi="ADLaM Display" w:cs="ADLaM Display"/>
+                <w:b/>
+                <w:bCs/>
+                <w:i/>
+                <w:iCs/>
+                <w:noProof/>
+                <w:sz w:val="28"/>
+                <w:szCs w:val="28"/>
+              </w:rPr>
+              <w:t>duction</w:t>
             </w:r>
             <w:r>
               <w:rPr>
@@ -1163,6 +1222,7 @@
               <w:kern w:val="2"/>
               <w:sz w:val="28"/>
               <w:szCs w:val="28"/>
+              <w:lang w:val="en-PK" w:eastAsia="en-PK"/>
               <w14:ligatures w14:val="standardContextual"/>
             </w:rPr>
           </w:pPr>
@@ -1179,7 +1239,35 @@
                 <w:sz w:val="28"/>
                 <w:szCs w:val="28"/>
               </w:rPr>
-              <w:t>2.1 Core Features</w:t>
+              <w:t>2.1 Core Fe</w:t>
+            </w:r>
+            <w:r>
+              <w:rPr>
+                <w:rStyle w:val="Hyperlink"/>
+                <w:rFonts w:ascii="ADLaM Display" w:hAnsi="ADLaM Display" w:cs="ADLaM Display"/>
+                <w:b/>
+                <w:bCs/>
+                <w:i/>
+                <w:iCs/>
+                <w:noProof/>
+                <w:sz w:val="28"/>
+                <w:szCs w:val="28"/>
+              </w:rPr>
+              <w:t>a</w:t>
+            </w:r>
+            <w:r>
+              <w:rPr>
+                <w:rStyle w:val="Hyperlink"/>
+                <w:rFonts w:ascii="ADLaM Display" w:hAnsi="ADLaM Display" w:cs="ADLaM Display"/>
+                <w:b/>
+                <w:bCs/>
+                <w:i/>
+                <w:iCs/>
+                <w:noProof/>
+                <w:sz w:val="28"/>
+                <w:szCs w:val="28"/>
+              </w:rPr>
+              <w:t>tures</w:t>
             </w:r>
             <w:r>
               <w:rPr>
@@ -1289,6 +1377,7 @@
               <w:kern w:val="2"/>
               <w:sz w:val="28"/>
               <w:szCs w:val="28"/>
+              <w:lang w:val="en-PK" w:eastAsia="en-PK"/>
               <w14:ligatures w14:val="standardContextual"/>
             </w:rPr>
           </w:pPr>
@@ -1305,7 +1394,35 @@
                 <w:sz w:val="28"/>
                 <w:szCs w:val="28"/>
               </w:rPr>
-              <w:t>2.2 Database Tables Overview</w:t>
+              <w:t xml:space="preserve">2.2 Database </w:t>
+            </w:r>
+            <w:r>
+              <w:rPr>
+                <w:rStyle w:val="Hyperlink"/>
+                <w:rFonts w:ascii="ADLaM Display" w:hAnsi="ADLaM Display" w:cs="ADLaM Display"/>
+                <w:b/>
+                <w:bCs/>
+                <w:i/>
+                <w:iCs/>
+                <w:noProof/>
+                <w:sz w:val="28"/>
+                <w:szCs w:val="28"/>
+              </w:rPr>
+              <w:t>T</w:t>
+            </w:r>
+            <w:r>
+              <w:rPr>
+                <w:rStyle w:val="Hyperlink"/>
+                <w:rFonts w:ascii="ADLaM Display" w:hAnsi="ADLaM Display" w:cs="ADLaM Display"/>
+                <w:b/>
+                <w:bCs/>
+                <w:i/>
+                <w:iCs/>
+                <w:noProof/>
+                <w:sz w:val="28"/>
+                <w:szCs w:val="28"/>
+              </w:rPr>
+              <w:t>ables Overview</w:t>
             </w:r>
             <w:r>
               <w:rPr>
@@ -1415,6 +1532,7 @@
               <w:kern w:val="2"/>
               <w:sz w:val="28"/>
               <w:szCs w:val="28"/>
+              <w:lang w:val="en-PK" w:eastAsia="en-PK"/>
               <w14:ligatures w14:val="standardContextual"/>
             </w:rPr>
           </w:pPr>
@@ -1431,7 +1549,35 @@
                 <w:sz w:val="28"/>
                 <w:szCs w:val="28"/>
               </w:rPr>
-              <w:t>2.3 Key Database Constraints</w:t>
+              <w:t xml:space="preserve">2.3 Key Database </w:t>
+            </w:r>
+            <w:r>
+              <w:rPr>
+                <w:rStyle w:val="Hyperlink"/>
+                <w:rFonts w:ascii="ADLaM Display" w:hAnsi="ADLaM Display" w:cs="ADLaM Display"/>
+                <w:b/>
+                <w:bCs/>
+                <w:i/>
+                <w:iCs/>
+                <w:noProof/>
+                <w:sz w:val="28"/>
+                <w:szCs w:val="28"/>
+              </w:rPr>
+              <w:t>C</w:t>
+            </w:r>
+            <w:r>
+              <w:rPr>
+                <w:rStyle w:val="Hyperlink"/>
+                <w:rFonts w:ascii="ADLaM Display" w:hAnsi="ADLaM Display" w:cs="ADLaM Display"/>
+                <w:b/>
+                <w:bCs/>
+                <w:i/>
+                <w:iCs/>
+                <w:noProof/>
+                <w:sz w:val="28"/>
+                <w:szCs w:val="28"/>
+              </w:rPr>
+              <w:t>onstraints</w:t>
             </w:r>
             <w:r>
               <w:rPr>
@@ -1541,6 +1687,7 @@
               <w:kern w:val="2"/>
               <w:sz w:val="28"/>
               <w:szCs w:val="28"/>
+              <w:lang w:val="en-PK" w:eastAsia="en-PK"/>
               <w14:ligatures w14:val="standardContextual"/>
             </w:rPr>
           </w:pPr>
@@ -1557,7 +1704,35 @@
                 <w:sz w:val="28"/>
                 <w:szCs w:val="28"/>
               </w:rPr>
-              <w:t>2.4 Entity-Relationship Diagram</w:t>
+              <w:t>2.4 Entity-Relations</w:t>
+            </w:r>
+            <w:r>
+              <w:rPr>
+                <w:rStyle w:val="Hyperlink"/>
+                <w:rFonts w:ascii="ADLaM Display" w:hAnsi="ADLaM Display" w:cs="ADLaM Display"/>
+                <w:b/>
+                <w:bCs/>
+                <w:i/>
+                <w:iCs/>
+                <w:noProof/>
+                <w:sz w:val="28"/>
+                <w:szCs w:val="28"/>
+              </w:rPr>
+              <w:t>h</w:t>
+            </w:r>
+            <w:r>
+              <w:rPr>
+                <w:rStyle w:val="Hyperlink"/>
+                <w:rFonts w:ascii="ADLaM Display" w:hAnsi="ADLaM Display" w:cs="ADLaM Display"/>
+                <w:b/>
+                <w:bCs/>
+                <w:i/>
+                <w:iCs/>
+                <w:noProof/>
+                <w:sz w:val="28"/>
+                <w:szCs w:val="28"/>
+              </w:rPr>
+              <w:t>ip Diagram</w:t>
             </w:r>
             <w:r>
               <w:rPr>
@@ -1667,6 +1842,7 @@
               <w:kern w:val="2"/>
               <w:sz w:val="28"/>
               <w:szCs w:val="28"/>
+              <w:lang w:val="en-PK" w:eastAsia="en-PK"/>
               <w14:ligatures w14:val="standardContextual"/>
             </w:rPr>
           </w:pPr>
@@ -1683,7 +1859,35 @@
                 <w:sz w:val="28"/>
                 <w:szCs w:val="28"/>
               </w:rPr>
-              <w:t>2.5 Relational Schema (Table Definitions)</w:t>
+              <w:t xml:space="preserve">2.5 Relational </w:t>
+            </w:r>
+            <w:r>
+              <w:rPr>
+                <w:rStyle w:val="Hyperlink"/>
+                <w:rFonts w:ascii="ADLaM Display" w:hAnsi="ADLaM Display" w:cs="ADLaM Display"/>
+                <w:b/>
+                <w:bCs/>
+                <w:i/>
+                <w:iCs/>
+                <w:noProof/>
+                <w:sz w:val="28"/>
+                <w:szCs w:val="28"/>
+              </w:rPr>
+              <w:t>S</w:t>
+            </w:r>
+            <w:r>
+              <w:rPr>
+                <w:rStyle w:val="Hyperlink"/>
+                <w:rFonts w:ascii="ADLaM Display" w:hAnsi="ADLaM Display" w:cs="ADLaM Display"/>
+                <w:b/>
+                <w:bCs/>
+                <w:i/>
+                <w:iCs/>
+                <w:noProof/>
+                <w:sz w:val="28"/>
+                <w:szCs w:val="28"/>
+              </w:rPr>
+              <w:t>chema (Table Definitions)</w:t>
             </w:r>
             <w:r>
               <w:rPr>
@@ -1793,6 +1997,7 @@
               <w:kern w:val="2"/>
               <w:sz w:val="28"/>
               <w:szCs w:val="28"/>
+              <w:lang w:val="en-PK" w:eastAsia="en-PK"/>
               <w14:ligatures w14:val="standardContextual"/>
             </w:rPr>
           </w:pPr>
@@ -1809,7 +2014,35 @@
                 <w:sz w:val="28"/>
                 <w:szCs w:val="28"/>
               </w:rPr>
-              <w:t>3. Related Work  (One Relevant Application)</w:t>
+              <w:t>3. Related Work  (On</w:t>
+            </w:r>
+            <w:r>
+              <w:rPr>
+                <w:rStyle w:val="Hyperlink"/>
+                <w:rFonts w:ascii="ADLaM Display" w:hAnsi="ADLaM Display" w:cs="ADLaM Display"/>
+                <w:b/>
+                <w:bCs/>
+                <w:i/>
+                <w:iCs/>
+                <w:noProof/>
+                <w:sz w:val="28"/>
+                <w:szCs w:val="28"/>
+              </w:rPr>
+              <w:t>e</w:t>
+            </w:r>
+            <w:r>
+              <w:rPr>
+                <w:rStyle w:val="Hyperlink"/>
+                <w:rFonts w:ascii="ADLaM Display" w:hAnsi="ADLaM Display" w:cs="ADLaM Display"/>
+                <w:b/>
+                <w:bCs/>
+                <w:i/>
+                <w:iCs/>
+                <w:noProof/>
+                <w:sz w:val="28"/>
+                <w:szCs w:val="28"/>
+              </w:rPr>
+              <w:t xml:space="preserve"> Relevant Application)</w:t>
             </w:r>
             <w:r>
               <w:rPr>
@@ -1919,6 +2152,7 @@
               <w:kern w:val="2"/>
               <w:sz w:val="28"/>
               <w:szCs w:val="28"/>
+              <w:lang w:val="en-PK" w:eastAsia="en-PK"/>
               <w14:ligatures w14:val="standardContextual"/>
             </w:rPr>
           </w:pPr>
@@ -2045,6 +2279,7 @@
               <w:kern w:val="2"/>
               <w:sz w:val="28"/>
               <w:szCs w:val="28"/>
+              <w:lang w:val="en-PK" w:eastAsia="en-PK"/>
               <w14:ligatures w14:val="standardContextual"/>
             </w:rPr>
           </w:pPr>
@@ -2061,7 +2296,35 @@
                 <w:sz w:val="28"/>
                 <w:szCs w:val="28"/>
               </w:rPr>
-              <w:t>3.2 Features</w:t>
+              <w:t>3.2 Feat</w:t>
+            </w:r>
+            <w:r>
+              <w:rPr>
+                <w:rStyle w:val="Hyperlink"/>
+                <w:rFonts w:ascii="ADLaM Display" w:hAnsi="ADLaM Display" w:cs="ADLaM Display"/>
+                <w:b/>
+                <w:bCs/>
+                <w:i/>
+                <w:iCs/>
+                <w:noProof/>
+                <w:sz w:val="28"/>
+                <w:szCs w:val="28"/>
+              </w:rPr>
+              <w:t>u</w:t>
+            </w:r>
+            <w:r>
+              <w:rPr>
+                <w:rStyle w:val="Hyperlink"/>
+                <w:rFonts w:ascii="ADLaM Display" w:hAnsi="ADLaM Display" w:cs="ADLaM Display"/>
+                <w:b/>
+                <w:bCs/>
+                <w:i/>
+                <w:iCs/>
+                <w:noProof/>
+                <w:sz w:val="28"/>
+                <w:szCs w:val="28"/>
+              </w:rPr>
+              <w:t>res</w:t>
             </w:r>
             <w:r>
               <w:rPr>
@@ -2171,6 +2434,7 @@
               <w:kern w:val="2"/>
               <w:sz w:val="28"/>
               <w:szCs w:val="28"/>
+              <w:lang w:val="en-PK" w:eastAsia="en-PK"/>
               <w14:ligatures w14:val="standardContextual"/>
             </w:rPr>
           </w:pPr>
@@ -2297,6 +2561,7 @@
               <w:kern w:val="2"/>
               <w:sz w:val="28"/>
               <w:szCs w:val="28"/>
+              <w:lang w:val="en-PK" w:eastAsia="en-PK"/>
               <w14:ligatures w14:val="standardContextual"/>
             </w:rPr>
           </w:pPr>
@@ -2313,7 +2578,35 @@
                 <w:sz w:val="28"/>
                 <w:szCs w:val="28"/>
               </w:rPr>
-              <w:t>4. Tools</w:t>
+              <w:t>4. To</w:t>
+            </w:r>
+            <w:r>
+              <w:rPr>
+                <w:rStyle w:val="Hyperlink"/>
+                <w:rFonts w:ascii="ADLaM Display" w:hAnsi="ADLaM Display" w:cs="ADLaM Display"/>
+                <w:b/>
+                <w:bCs/>
+                <w:i/>
+                <w:iCs/>
+                <w:noProof/>
+                <w:sz w:val="28"/>
+                <w:szCs w:val="28"/>
+              </w:rPr>
+              <w:t>o</w:t>
+            </w:r>
+            <w:r>
+              <w:rPr>
+                <w:rStyle w:val="Hyperlink"/>
+                <w:rFonts w:ascii="ADLaM Display" w:hAnsi="ADLaM Display" w:cs="ADLaM Display"/>
+                <w:b/>
+                <w:bCs/>
+                <w:i/>
+                <w:iCs/>
+                <w:noProof/>
+                <w:sz w:val="28"/>
+                <w:szCs w:val="28"/>
+              </w:rPr>
+              <w:t>ls</w:t>
             </w:r>
             <w:r>
               <w:rPr>
@@ -2423,6 +2716,7 @@
               <w:kern w:val="2"/>
               <w:sz w:val="28"/>
               <w:szCs w:val="28"/>
+              <w:lang w:val="en-PK" w:eastAsia="en-PK"/>
               <w14:ligatures w14:val="standardContextual"/>
             </w:rPr>
           </w:pPr>
@@ -2439,7 +2733,35 @@
                 <w:sz w:val="28"/>
                 <w:szCs w:val="28"/>
               </w:rPr>
-              <w:t>5. References</w:t>
+              <w:t>5. Refe</w:t>
+            </w:r>
+            <w:r>
+              <w:rPr>
+                <w:rStyle w:val="Hyperlink"/>
+                <w:rFonts w:ascii="ADLaM Display" w:hAnsi="ADLaM Display" w:cs="ADLaM Display"/>
+                <w:b/>
+                <w:bCs/>
+                <w:i/>
+                <w:iCs/>
+                <w:noProof/>
+                <w:sz w:val="28"/>
+                <w:szCs w:val="28"/>
+              </w:rPr>
+              <w:t>r</w:t>
+            </w:r>
+            <w:r>
+              <w:rPr>
+                <w:rStyle w:val="Hyperlink"/>
+                <w:rFonts w:ascii="ADLaM Display" w:hAnsi="ADLaM Display" w:cs="ADLaM Display"/>
+                <w:b/>
+                <w:bCs/>
+                <w:i/>
+                <w:iCs/>
+                <w:noProof/>
+                <w:sz w:val="28"/>
+                <w:szCs w:val="28"/>
+              </w:rPr>
+              <w:t>ences</w:t>
             </w:r>
             <w:r>
               <w:rPr>
@@ -2561,6 +2883,2543 @@
           <w:cols w:space="720"/>
           <w:docGrid w:linePitch="360"/>
         </w:sectPr>
+      </w:pPr>
+    </w:p>
+    <w:p>
+      <w:pPr>
+        <w:pStyle w:val="Heading1"/>
+        <w:pBdr>
+          <w:bottom w:val="single" w:sz="10" w:space="4" w:color="2E4DA0"/>
+        </w:pBdr>
+      </w:pPr>
+      <w:bookmarkStart w:id="51" w:name="_Toc229261689"/>
+      <w:r>
+        <w:lastRenderedPageBreak/>
+        <w:t>1. Abstract</w:t>
+      </w:r>
+      <w:bookmarkEnd w:id="51"/>
+    </w:p>
+    <w:p>
+      <w:pPr>
+        <w:spacing w:after="140" w:line="288" w:lineRule="auto"/>
+        <w:jc w:val="both"/>
+      </w:pPr>
+      <w:r>
+        <w:t>In </w:t>
+      </w:r>
+      <w:r>
+        <w:rPr>
+          <w:b/>
+          <w:bCs/>
+        </w:rPr>
+        <w:t>large metropolitan cities</w:t>
+      </w:r>
+      <w:r>
+        <w:t>, the number of </w:t>
+      </w:r>
+      <w:r>
+        <w:rPr>
+          <w:b/>
+          <w:bCs/>
+        </w:rPr>
+        <w:t>vehicles far exceeds</w:t>
+      </w:r>
+      <w:r>
+        <w:t> the available </w:t>
+      </w:r>
+      <w:r>
+        <w:rPr>
+          <w:b/>
+          <w:bCs/>
+        </w:rPr>
+        <w:t>parking infrastructure</w:t>
+      </w:r>
+      <w:r>
+        <w:t>. On a single busy avenue, </w:t>
+      </w:r>
+      <w:r>
+        <w:rPr>
+          <w:b/>
+          <w:bCs/>
+        </w:rPr>
+        <w:t>hundreds of drivers</w:t>
+      </w:r>
+      <w:r>
+        <w:t> compete for a </w:t>
+      </w:r>
+      <w:r>
+        <w:rPr>
+          <w:b/>
+          <w:bCs/>
+        </w:rPr>
+        <w:t>handful of spaces</w:t>
+      </w:r>
+      <w:r>
+        <w:t>, leading to </w:t>
+      </w:r>
+      <w:r>
+        <w:rPr>
+          <w:b/>
+          <w:bCs/>
+        </w:rPr>
+        <w:t>traffic congestion</w:t>
+      </w:r>
+      <w:r>
+        <w:t>, </w:t>
+      </w:r>
+      <w:r>
+        <w:rPr>
+          <w:b/>
+          <w:bCs/>
+        </w:rPr>
+        <w:t>lost time</w:t>
+      </w:r>
+      <w:r>
+        <w:t>, and </w:t>
+      </w:r>
+      <w:r>
+        <w:rPr>
+          <w:b/>
+          <w:bCs/>
+        </w:rPr>
+        <w:t>driver frustration</w:t>
+      </w:r>
+      <w:r>
+        <w:t>. Traditional parking lots rely on </w:t>
+      </w:r>
+      <w:r>
+        <w:rPr>
+          <w:b/>
+          <w:bCs/>
+        </w:rPr>
+        <w:t>manual processes</w:t>
+      </w:r>
+      <w:r>
+        <w:t> for </w:t>
+      </w:r>
+      <w:r>
+        <w:rPr>
+          <w:b/>
+          <w:bCs/>
+        </w:rPr>
+        <w:t>spot allocation</w:t>
+      </w:r>
+      <w:r>
+        <w:t>, </w:t>
+      </w:r>
+      <w:r>
+        <w:rPr>
+          <w:b/>
+          <w:bCs/>
+        </w:rPr>
+        <w:t>payment collection</w:t>
+      </w:r>
+      <w:r>
+        <w:t>, and </w:t>
+      </w:r>
+      <w:r>
+        <w:rPr>
+          <w:b/>
+          <w:bCs/>
+        </w:rPr>
+        <w:t>violation enforcement</w:t>
+      </w:r>
+      <w:r>
+        <w:t>, resulting in </w:t>
+      </w:r>
+      <w:r>
+        <w:rPr>
+          <w:b/>
+          <w:bCs/>
+        </w:rPr>
+        <w:t>inefficiency</w:t>
+      </w:r>
+      <w:r>
+        <w:t>, </w:t>
+      </w:r>
+      <w:r>
+        <w:rPr>
+          <w:b/>
+          <w:bCs/>
+        </w:rPr>
+        <w:t>revenue loss</w:t>
+      </w:r>
+      <w:r>
+        <w:t>, and a </w:t>
+      </w:r>
+      <w:r>
+        <w:rPr>
+          <w:b/>
+          <w:bCs/>
+        </w:rPr>
+        <w:t>poor user experience</w:t>
+      </w:r>
+      <w:r>
+        <w:t>. This project presents a</w:t>
+      </w:r>
+      <w:r>
+        <w:rPr>
+          <w:b/>
+          <w:bCs/>
+        </w:rPr>
+        <w:t xml:space="preserve"> Smart Parking System</w:t>
+      </w:r>
+      <w:r>
+        <w:t> that automates </w:t>
+      </w:r>
+      <w:r>
+        <w:rPr>
+          <w:b/>
+          <w:bCs/>
+        </w:rPr>
+        <w:t>reservations</w:t>
+      </w:r>
+      <w:r>
+        <w:t>, payments through a </w:t>
+      </w:r>
+      <w:r>
+        <w:rPr>
+          <w:b/>
+          <w:bCs/>
+        </w:rPr>
+        <w:t>digital wallet</w:t>
+      </w:r>
+      <w:r>
+        <w:t>, </w:t>
+      </w:r>
+      <w:r>
+        <w:rPr>
+          <w:b/>
+          <w:bCs/>
+        </w:rPr>
+        <w:t>dynamic demand</w:t>
+      </w:r>
+      <w:r>
+        <w:rPr>
+          <w:b/>
+          <w:bCs/>
+        </w:rPr>
+        <w:noBreakHyphen/>
+        <w:t>based pricing</w:t>
+      </w:r>
+      <w:r>
+        <w:t>, </w:t>
+      </w:r>
+      <w:r>
+        <w:rPr>
+          <w:b/>
+          <w:bCs/>
+        </w:rPr>
+        <w:t>automated overstay fines</w:t>
+      </w:r>
+      <w:r>
+        <w:t>, a </w:t>
+      </w:r>
+      <w:r>
+        <w:rPr>
+          <w:b/>
+          <w:bCs/>
+        </w:rPr>
+        <w:t>loyalty rewards programme</w:t>
+      </w:r>
+      <w:r>
+        <w:t>, and </w:t>
+      </w:r>
+      <w:r>
+        <w:rPr>
+          <w:b/>
+          <w:bCs/>
+        </w:rPr>
+        <w:t>administrative CSV reports</w:t>
+      </w:r>
+      <w:r>
+        <w:t>, all implemented as a complete project.</w:t>
+      </w:r>
+    </w:p>
+    <w:p>
+      <w:pPr>
+        <w:pStyle w:val="Heading1"/>
+        <w:pBdr>
+          <w:bottom w:val="single" w:sz="10" w:space="4" w:color="2E4DA0"/>
+        </w:pBdr>
+      </w:pPr>
+      <w:bookmarkStart w:id="52" w:name="_Toc229261690"/>
+      <w:r>
+        <w:t>2. Introduction</w:t>
+      </w:r>
+      <w:bookmarkEnd w:id="52"/>
+    </w:p>
+    <w:p>
+      <w:pPr>
+        <w:spacing w:after="140" w:line="288" w:lineRule="auto"/>
+        <w:jc w:val="both"/>
+      </w:pPr>
+      <w:r>
+        <w:t xml:space="preserve">The </w:t>
+      </w:r>
+      <w:r>
+        <w:rPr>
+          <w:b/>
+          <w:bCs/>
+        </w:rPr>
+        <w:t>Smart Parking System</w:t>
+      </w:r>
+      <w:r>
+        <w:t xml:space="preserve"> is a full-stack web application built to digitalise paid parking lot operations. It manages </w:t>
+      </w:r>
+      <w:r>
+        <w:rPr>
+          <w:b/>
+          <w:bCs/>
+        </w:rPr>
+        <w:t>nine interconnected database tables</w:t>
+      </w:r>
+      <w:r>
+        <w:t xml:space="preserve"> covering users, parking spots, reservations, violations, loyalty points, transactions, discount coupons, vehicle types and wallet transactions.</w:t>
+      </w:r>
+    </w:p>
+    <w:p>
+      <w:pPr>
+        <w:spacing w:after="60"/>
+      </w:pPr>
+    </w:p>
+    <w:p>
+      <w:pPr>
+        <w:pStyle w:val="Heading2"/>
+      </w:pPr>
+      <w:bookmarkStart w:id="53" w:name="_Toc229261691"/>
+      <w:r>
+        <w:t>2.1 Core Features</w:t>
+      </w:r>
+      <w:bookmarkEnd w:id="53"/>
+    </w:p>
+    <w:p>
+      <w:pPr>
+        <w:pStyle w:val="ListParagraph"/>
+        <w:numPr>
+          <w:ilvl w:val="0"/>
+          <w:numId w:val="2"/>
+        </w:numPr>
+        <w:spacing w:after="90"/>
+        <w:jc w:val="both"/>
+      </w:pPr>
+      <w:r>
+        <w:rPr>
+          <w:b/>
+          <w:bCs/>
+        </w:rPr>
+        <w:t xml:space="preserve">User Registration &amp; Login: </w:t>
+      </w:r>
+      <w:r>
+        <w:t>Secure accounts with crypt-hashed passwords and a unique referral code per user.</w:t>
+      </w:r>
+    </w:p>
+    <w:p>
+      <w:pPr>
+        <w:pStyle w:val="ListParagraph"/>
+        <w:numPr>
+          <w:ilvl w:val="0"/>
+          <w:numId w:val="2"/>
+        </w:numPr>
+        <w:spacing w:after="90"/>
+        <w:jc w:val="both"/>
+      </w:pPr>
+      <w:r>
+        <w:rPr>
+          <w:b/>
+          <w:bCs/>
+        </w:rPr>
+        <w:t xml:space="preserve">Real-Time Spot Availability: </w:t>
+      </w:r>
+      <w:r>
+        <w:t>Only genuinely free spots are shown for the chosen time window — no double-booking possible.</w:t>
+      </w:r>
+    </w:p>
+    <w:p>
+      <w:pPr>
+        <w:pStyle w:val="ListParagraph"/>
+        <w:numPr>
+          <w:ilvl w:val="0"/>
+          <w:numId w:val="2"/>
+        </w:numPr>
+        <w:spacing w:after="90"/>
+        <w:jc w:val="both"/>
+      </w:pPr>
+      <w:r>
+        <w:rPr>
+          <w:b/>
+          <w:bCs/>
+        </w:rPr>
+        <w:t xml:space="preserve">Dynamic Pricing: </w:t>
+      </w:r>
+      <w:r>
+        <w:t xml:space="preserve">A stored procedure checks zone occupancy. If occupancy exceeds </w:t>
+      </w:r>
+      <w:r>
+        <w:rPr>
+          <w:b/>
+          <w:bCs/>
+        </w:rPr>
+        <w:t>80%</w:t>
+      </w:r>
+      <w:r>
+        <w:t xml:space="preserve">, the hourly rate rises from </w:t>
+      </w:r>
+      <w:r>
+        <w:rPr>
+          <w:b/>
+          <w:bCs/>
+        </w:rPr>
+        <w:t>PKR 80 per hour (for a Car)</w:t>
+      </w:r>
+      <w:r>
+        <w:t xml:space="preserve"> to </w:t>
+      </w:r>
+      <w:r>
+        <w:rPr>
+          <w:b/>
+          <w:bCs/>
+        </w:rPr>
+        <w:t>PKR 96 per hour (for a Car)</w:t>
+      </w:r>
+      <w:r>
+        <w:t xml:space="preserve"> (+20%).</w:t>
+      </w:r>
+    </w:p>
+    <w:p>
+      <w:pPr>
+        <w:pStyle w:val="ListParagraph"/>
+        <w:numPr>
+          <w:ilvl w:val="0"/>
+          <w:numId w:val="2"/>
+        </w:numPr>
+        <w:spacing w:after="90"/>
+        <w:jc w:val="both"/>
+      </w:pPr>
+      <w:r>
+        <w:rPr>
+          <w:b/>
+          <w:bCs/>
+        </w:rPr>
+        <w:t xml:space="preserve">Vehicle Types: </w:t>
+      </w:r>
+      <w:r>
+        <w:rPr>
+          <w:i/>
+          <w:iCs/>
+        </w:rPr>
+        <w:t>The system supports three vehicle types – Bike (PKR 40/hr), Car (PKR 80/hr), and SUV (PKR 120/hr) – with dynamic pricing applied to each.</w:t>
+      </w:r>
+    </w:p>
+    <w:p>
+      <w:pPr>
+        <w:pStyle w:val="ListParagraph"/>
+        <w:numPr>
+          <w:ilvl w:val="0"/>
+          <w:numId w:val="2"/>
+        </w:numPr>
+        <w:spacing w:after="90"/>
+        <w:jc w:val="both"/>
+      </w:pPr>
+      <w:r>
+        <w:rPr>
+          <w:b/>
+          <w:bCs/>
+        </w:rPr>
+        <w:t xml:space="preserve">Digital Wallet: </w:t>
+      </w:r>
+      <w:r>
+        <w:t>Users pre-load a wallet balance; all booking and fine charges are deducted automatically.</w:t>
+      </w:r>
+    </w:p>
+    <w:p>
+      <w:pPr>
+        <w:pStyle w:val="ListParagraph"/>
+        <w:numPr>
+          <w:ilvl w:val="0"/>
+          <w:numId w:val="2"/>
+        </w:numPr>
+        <w:spacing w:after="90"/>
+        <w:jc w:val="both"/>
+      </w:pPr>
+      <w:r>
+        <w:rPr>
+          <w:b/>
+          <w:bCs/>
+        </w:rPr>
+        <w:t xml:space="preserve">Automated Overstay Fines: </w:t>
+      </w:r>
+      <w:r>
+        <w:t xml:space="preserve">Overdue active reservations are detected and fined automatically — </w:t>
+      </w:r>
+      <w:r>
+        <w:rPr>
+          <w:b/>
+          <w:bCs/>
+        </w:rPr>
+        <w:t>PKR 100 base + PKR 50 per extra hour</w:t>
+      </w:r>
+      <w:r>
+        <w:t xml:space="preserve">. </w:t>
+      </w:r>
+      <w:r>
+        <w:rPr>
+          <w:i/>
+          <w:iCs/>
+        </w:rPr>
+        <w:t>For example, if a user overstays by 2 hours, the fine is PKR 100 + 2×50 = PKR 200.</w:t>
+      </w:r>
+    </w:p>
+    <w:p>
+      <w:pPr>
+        <w:pStyle w:val="ListParagraph"/>
+        <w:numPr>
+          <w:ilvl w:val="0"/>
+          <w:numId w:val="2"/>
+        </w:numPr>
+        <w:spacing w:after="90"/>
+        <w:jc w:val="both"/>
+      </w:pPr>
+      <w:r>
+        <w:rPr>
+          <w:b/>
+          <w:bCs/>
+        </w:rPr>
+        <w:t xml:space="preserve">Loyalty Points &amp; Coupons: </w:t>
+      </w:r>
+      <w:r>
+        <w:t>10 points earned per PKR spent; 500 points redeemable for a PKR 50 discount coupon. +10 bonus points for bookings after 18:00.</w:t>
+      </w:r>
+    </w:p>
+    <w:p>
+      <w:pPr>
+        <w:pStyle w:val="ListParagraph"/>
+        <w:numPr>
+          <w:ilvl w:val="0"/>
+          <w:numId w:val="2"/>
+        </w:numPr>
+        <w:spacing w:after="90"/>
+        <w:jc w:val="both"/>
+      </w:pPr>
+      <w:r>
+        <w:rPr>
+          <w:b/>
+          <w:bCs/>
+        </w:rPr>
+        <w:t xml:space="preserve">Referral Programme: </w:t>
+      </w:r>
+      <w:r>
+        <w:t>New user registers with a referral code → both parties receive 200 bonus points instantly.</w:t>
+      </w:r>
+    </w:p>
+    <w:p>
+      <w:pPr>
+        <w:pStyle w:val="ListParagraph"/>
+        <w:numPr>
+          <w:ilvl w:val="0"/>
+          <w:numId w:val="2"/>
+        </w:numPr>
+        <w:spacing w:after="90"/>
+        <w:jc w:val="both"/>
+      </w:pPr>
+      <w:r>
+        <w:rPr>
+          <w:b/>
+          <w:bCs/>
+        </w:rPr>
+        <w:t xml:space="preserve">Administrative Reports: </w:t>
+      </w:r>
+      <w:r>
+        <w:t>Weekly revenue, top customers, loyalty leaderboard, and unpaid violations — all exportable as CSV files.</w:t>
+      </w:r>
+    </w:p>
+    <w:p>
+      <w:pPr>
+        <w:spacing w:after="120"/>
+      </w:pPr>
+    </w:p>
+    <w:p>
+      <w:pPr>
+        <w:spacing w:before="120" w:after="60"/>
+        <w:jc w:val="center"/>
+      </w:pPr>
+      <w:r>
+        <w:rPr>
+          <w:noProof/>
+        </w:rPr>
+        <w:lastRenderedPageBreak/>
+        <w:drawing>
+          <wp:inline distT="0" distB="0" distL="0" distR="0" wp14:anchorId="4E1BB74E" wp14:editId="1853FF42">
+            <wp:extent cx="4762500" cy="3048000"/>
+            <wp:effectExtent l="0" t="0" r="0" b="0"/>
+            <wp:docPr id="280574984" name="Picture 280574984"/>
+            <wp:cNvGraphicFramePr>
+              <a:graphicFrameLocks xmlns:a="http://schemas.openxmlformats.org/drawingml/2006/main" noChangeAspect="1"/>
+            </wp:cNvGraphicFramePr>
+            <a:graphic xmlns:a="http://schemas.openxmlformats.org/drawingml/2006/main">
+              <a:graphicData uri="http://schemas.openxmlformats.org/drawingml/2006/picture">
+                <pic:pic xmlns:pic="http://schemas.openxmlformats.org/drawingml/2006/picture">
+                  <pic:nvPicPr>
+                    <pic:cNvPr id="0" name=""/>
+                    <pic:cNvPicPr>
+                      <a:picLocks noChangeAspect="1" noChangeArrowheads="1"/>
+                    </pic:cNvPicPr>
+                  </pic:nvPicPr>
+                  <pic:blipFill>
+                    <a:blip r:embed="rId11"/>
+                    <a:srcRect/>
+                    <a:stretch>
+                      <a:fillRect/>
+                    </a:stretch>
+                  </pic:blipFill>
+                  <pic:spPr bwMode="auto">
+                    <a:xfrm>
+                      <a:off x="0" y="0"/>
+                      <a:ext cx="4762500" cy="3048000"/>
+                    </a:xfrm>
+                    <a:prstGeom prst="rect">
+                      <a:avLst/>
+                    </a:prstGeom>
+                  </pic:spPr>
+                </pic:pic>
+              </a:graphicData>
+            </a:graphic>
+          </wp:inline>
+        </w:drawing>
+      </w:r>
+    </w:p>
+    <w:p>
+      <w:pPr>
+        <w:spacing w:before="60" w:after="160"/>
+        <w:jc w:val="center"/>
+      </w:pPr>
+      <w:r>
+        <w:rPr>
+          <w:i/>
+          <w:iCs/>
+          <w:color w:val="555555"/>
+          <w:sz w:val="20"/>
+          <w:szCs w:val="20"/>
+        </w:rPr>
+        <w:t>Figure 1: Dynamic Pricing Impact — price multiplier rises to 1.2× when zone occupancy exceeds 80%</w:t>
+      </w:r>
+    </w:p>
+    <w:p>
+      <w:pPr>
+        <w:spacing w:after="100"/>
+      </w:pPr>
+    </w:p>
+    <w:p>
+      <w:pPr>
+        <w:spacing w:before="120" w:after="60"/>
+        <w:jc w:val="center"/>
+      </w:pPr>
+      <w:r>
+        <w:rPr>
+          <w:noProof/>
+        </w:rPr>
+        <w:drawing>
+          <wp:inline distT="0" distB="0" distL="0" distR="0" wp14:anchorId="69744B3C" wp14:editId="2D7728D8">
+            <wp:extent cx="4762500" cy="3048000"/>
+            <wp:effectExtent l="0" t="0" r="0" b="0"/>
+            <wp:docPr id="2056989779" name="Picture 2056989779"/>
+            <wp:cNvGraphicFramePr>
+              <a:graphicFrameLocks xmlns:a="http://schemas.openxmlformats.org/drawingml/2006/main" noChangeAspect="1"/>
+            </wp:cNvGraphicFramePr>
+            <a:graphic xmlns:a="http://schemas.openxmlformats.org/drawingml/2006/main">
+              <a:graphicData uri="http://schemas.openxmlformats.org/drawingml/2006/picture">
+                <pic:pic xmlns:pic="http://schemas.openxmlformats.org/drawingml/2006/picture">
+                  <pic:nvPicPr>
+                    <pic:cNvPr id="0" name=""/>
+                    <pic:cNvPicPr>
+                      <a:picLocks noChangeAspect="1" noChangeArrowheads="1"/>
+                    </pic:cNvPicPr>
+                  </pic:nvPicPr>
+                  <pic:blipFill>
+                    <a:blip r:embed="rId12"/>
+                    <a:srcRect/>
+                    <a:stretch>
+                      <a:fillRect/>
+                    </a:stretch>
+                  </pic:blipFill>
+                  <pic:spPr bwMode="auto">
+                    <a:xfrm>
+                      <a:off x="0" y="0"/>
+                      <a:ext cx="4762500" cy="3048000"/>
+                    </a:xfrm>
+                    <a:prstGeom prst="rect">
+                      <a:avLst/>
+                    </a:prstGeom>
+                  </pic:spPr>
+                </pic:pic>
+              </a:graphicData>
+            </a:graphic>
+          </wp:inline>
+        </w:drawing>
+      </w:r>
+    </w:p>
+    <w:p>
+      <w:pPr>
+        <w:spacing w:before="60" w:after="160"/>
+        <w:jc w:val="center"/>
+      </w:pPr>
+      <w:r>
+        <w:rPr>
+          <w:i/>
+          <w:iCs/>
+          <w:color w:val="555555"/>
+          <w:sz w:val="20"/>
+          <w:szCs w:val="20"/>
+        </w:rPr>
+        <w:t>Figure 2: Projected Weekly Revenue Trend — consistent upward growth of +PKR 3,230 per week</w:t>
+      </w:r>
+    </w:p>
+    <w:p>
+      <w:pPr>
+        <w:spacing w:after="80"/>
+      </w:pPr>
+    </w:p>
+    <w:p>
+      <w:pPr>
+        <w:pStyle w:val="Heading2"/>
+      </w:pPr>
+    </w:p>
+    <w:p>
+      <w:pPr>
+        <w:pStyle w:val="Heading2"/>
+      </w:pPr>
+    </w:p>
+    <w:p>
+      <w:pPr>
+        <w:pStyle w:val="Heading2"/>
+      </w:pPr>
+    </w:p>
+    <w:p>
+      <w:pPr>
+        <w:pStyle w:val="Heading2"/>
+      </w:pPr>
+    </w:p>
+    <w:p>
+      <w:pPr>
+        <w:pStyle w:val="Heading2"/>
+      </w:pPr>
+    </w:p>
+    <w:p>
+      <w:pPr>
+        <w:pStyle w:val="Heading2"/>
+      </w:pPr>
+      <w:bookmarkStart w:id="54" w:name="_Toc229261692"/>
+      <w:r>
+        <w:lastRenderedPageBreak/>
+        <w:t>2.2 Database Tables Overview</w:t>
+      </w:r>
+      <w:bookmarkEnd w:id="54"/>
+    </w:p>
+    <w:p>
+      <w:pPr>
+        <w:spacing w:after="40"/>
+      </w:pPr>
+    </w:p>
+    <w:tbl>
+      <w:tblPr>
+        <w:tblW w:w="9360" w:type="dxa"/>
+        <w:tblBorders>
+          <w:top w:val="single" w:sz="4" w:space="0" w:color="auto"/>
+          <w:left w:val="single" w:sz="4" w:space="0" w:color="auto"/>
+          <w:bottom w:val="single" w:sz="4" w:space="0" w:color="auto"/>
+          <w:right w:val="single" w:sz="4" w:space="0" w:color="auto"/>
+          <w:insideH w:val="single" w:sz="4" w:space="0" w:color="auto"/>
+          <w:insideV w:val="single" w:sz="4" w:space="0" w:color="auto"/>
+        </w:tblBorders>
+        <w:tblCellMar>
+          <w:left w:w="10" w:type="dxa"/>
+          <w:right w:w="10" w:type="dxa"/>
+        </w:tblCellMar>
+        <w:tblLook w:val="04A0" w:firstRow="1" w:lastRow="0" w:firstColumn="1" w:lastColumn="0" w:noHBand="0" w:noVBand="1"/>
+      </w:tblPr>
+      <w:tblGrid>
+        <w:gridCol w:w="2848"/>
+        <w:gridCol w:w="6512"/>
+      </w:tblGrid>
+      <w:tr>
+        <w:trPr>
+          <w:tblHeader/>
+        </w:trPr>
+        <w:tc>
+          <w:tcPr>
+            <w:tcW w:w="2000" w:type="dxa"/>
+            <w:tcBorders>
+              <w:top w:val="single" w:sz="4" w:space="0" w:color="1A5276"/>
+              <w:left w:val="single" w:sz="4" w:space="0" w:color="1A5276"/>
+              <w:bottom w:val="single" w:sz="4" w:space="0" w:color="1A5276"/>
+              <w:right w:val="single" w:sz="4" w:space="0" w:color="1A5276"/>
+            </w:tcBorders>
+            <w:shd w:val="clear" w:color="auto" w:fill="1A5276"/>
+            <w:tcMar>
+              <w:top w:w="100" w:type="dxa"/>
+              <w:left w:w="140" w:type="dxa"/>
+              <w:bottom w:w="100" w:type="dxa"/>
+              <w:right w:w="140" w:type="dxa"/>
+            </w:tcMar>
+            <w:vAlign w:val="center"/>
+          </w:tcPr>
+          <w:p>
+            <w:pPr>
+              <w:jc w:val="center"/>
+            </w:pPr>
+            <w:r>
+              <w:rPr>
+                <w:rFonts w:ascii="Arial" w:eastAsia="Arial" w:hAnsi="Arial" w:cs="Arial"/>
+                <w:b/>
+                <w:bCs/>
+                <w:color w:val="FFFFFF"/>
+                <w:sz w:val="20"/>
+                <w:szCs w:val="20"/>
+              </w:rPr>
+              <w:t>Table</w:t>
+            </w:r>
+          </w:p>
+        </w:tc>
+        <w:tc>
+          <w:tcPr>
+            <w:tcW w:w="7360" w:type="dxa"/>
+            <w:tcBorders>
+              <w:top w:val="single" w:sz="4" w:space="0" w:color="1A5276"/>
+              <w:left w:val="single" w:sz="4" w:space="0" w:color="1A5276"/>
+              <w:bottom w:val="single" w:sz="4" w:space="0" w:color="1A5276"/>
+              <w:right w:val="single" w:sz="4" w:space="0" w:color="1A5276"/>
+            </w:tcBorders>
+            <w:shd w:val="clear" w:color="auto" w:fill="1A5276"/>
+            <w:tcMar>
+              <w:top w:w="100" w:type="dxa"/>
+              <w:left w:w="140" w:type="dxa"/>
+              <w:bottom w:w="100" w:type="dxa"/>
+              <w:right w:w="140" w:type="dxa"/>
+            </w:tcMar>
+            <w:vAlign w:val="center"/>
+          </w:tcPr>
+          <w:p>
+            <w:pPr>
+              <w:jc w:val="center"/>
+            </w:pPr>
+            <w:r>
+              <w:rPr>
+                <w:rFonts w:ascii="Arial" w:eastAsia="Arial" w:hAnsi="Arial" w:cs="Arial"/>
+                <w:b/>
+                <w:bCs/>
+                <w:color w:val="FFFFFF"/>
+                <w:sz w:val="20"/>
+                <w:szCs w:val="20"/>
+              </w:rPr>
+              <w:t>Purpose</w:t>
+            </w:r>
+          </w:p>
+        </w:tc>
+      </w:tr>
+      <w:tr>
+        <w:tc>
+          <w:tcPr>
+            <w:tcW w:w="2000" w:type="dxa"/>
+            <w:tcBorders>
+              <w:top w:val="single" w:sz="4" w:space="0" w:color="CCCCCC"/>
+              <w:left w:val="single" w:sz="4" w:space="0" w:color="CCCCCC"/>
+              <w:bottom w:val="single" w:sz="4" w:space="0" w:color="CCCCCC"/>
+              <w:right w:val="single" w:sz="4" w:space="0" w:color="CCCCCC"/>
+            </w:tcBorders>
+            <w:shd w:val="clear" w:color="auto" w:fill="FFFFFF"/>
+            <w:tcMar>
+              <w:top w:w="80" w:type="dxa"/>
+              <w:left w:w="140" w:type="dxa"/>
+              <w:bottom w:w="80" w:type="dxa"/>
+              <w:right w:w="140" w:type="dxa"/>
+            </w:tcMar>
+            <w:vAlign w:val="center"/>
+          </w:tcPr>
+          <w:p>
+            <w:pPr>
+              <w:jc w:val="center"/>
+            </w:pPr>
+            <w:r>
+              <w:rPr>
+                <w:b/>
+                <w:bCs/>
+                <w:color w:val="1A5276"/>
+                <w:sz w:val="20"/>
+                <w:szCs w:val="20"/>
+              </w:rPr>
+              <w:t>USERS</w:t>
+            </w:r>
+          </w:p>
+        </w:tc>
+        <w:tc>
+          <w:tcPr>
+            <w:tcW w:w="7360" w:type="dxa"/>
+            <w:tcBorders>
+              <w:top w:val="single" w:sz="4" w:space="0" w:color="CCCCCC"/>
+              <w:left w:val="single" w:sz="4" w:space="0" w:color="CCCCCC"/>
+              <w:bottom w:val="single" w:sz="4" w:space="0" w:color="CCCCCC"/>
+              <w:right w:val="single" w:sz="4" w:space="0" w:color="CCCCCC"/>
+            </w:tcBorders>
+            <w:shd w:val="clear" w:color="auto" w:fill="FFFFFF"/>
+            <w:tcMar>
+              <w:top w:w="80" w:type="dxa"/>
+              <w:left w:w="140" w:type="dxa"/>
+              <w:bottom w:w="80" w:type="dxa"/>
+              <w:right w:w="140" w:type="dxa"/>
+            </w:tcMar>
+            <w:vAlign w:val="center"/>
+          </w:tcPr>
+          <w:p>
+            <w:pPr>
+              <w:jc w:val="center"/>
+              <w:rPr>
+                <w:sz w:val="20"/>
+                <w:szCs w:val="20"/>
+              </w:rPr>
+            </w:pPr>
+            <w:r>
+              <w:rPr>
+                <w:sz w:val="20"/>
+                <w:szCs w:val="20"/>
+              </w:rPr>
+              <w:t>User Accounts</w:t>
+            </w:r>
+          </w:p>
+        </w:tc>
+      </w:tr>
+      <w:tr>
+        <w:tc>
+          <w:tcPr>
+            <w:tcW w:w="2000" w:type="dxa"/>
+            <w:tcBorders>
+              <w:top w:val="single" w:sz="4" w:space="0" w:color="CCCCCC"/>
+              <w:left w:val="single" w:sz="4" w:space="0" w:color="CCCCCC"/>
+              <w:bottom w:val="single" w:sz="4" w:space="0" w:color="CCCCCC"/>
+              <w:right w:val="single" w:sz="4" w:space="0" w:color="CCCCCC"/>
+            </w:tcBorders>
+            <w:shd w:val="clear" w:color="auto" w:fill="EBF3FB"/>
+            <w:tcMar>
+              <w:top w:w="80" w:type="dxa"/>
+              <w:left w:w="140" w:type="dxa"/>
+              <w:bottom w:w="80" w:type="dxa"/>
+              <w:right w:w="140" w:type="dxa"/>
+            </w:tcMar>
+            <w:vAlign w:val="center"/>
+          </w:tcPr>
+          <w:p>
+            <w:pPr>
+              <w:jc w:val="center"/>
+            </w:pPr>
+            <w:r>
+              <w:rPr>
+                <w:b/>
+                <w:bCs/>
+                <w:color w:val="1A5276"/>
+                <w:sz w:val="20"/>
+                <w:szCs w:val="20"/>
+              </w:rPr>
+              <w:t>VEHICLE_TYPES</w:t>
+            </w:r>
+          </w:p>
+        </w:tc>
+        <w:tc>
+          <w:tcPr>
+            <w:tcW w:w="7360" w:type="dxa"/>
+            <w:tcBorders>
+              <w:top w:val="single" w:sz="4" w:space="0" w:color="CCCCCC"/>
+              <w:left w:val="single" w:sz="4" w:space="0" w:color="CCCCCC"/>
+              <w:bottom w:val="single" w:sz="4" w:space="0" w:color="CCCCCC"/>
+              <w:right w:val="single" w:sz="4" w:space="0" w:color="CCCCCC"/>
+            </w:tcBorders>
+            <w:shd w:val="clear" w:color="auto" w:fill="EBF3FB"/>
+            <w:tcMar>
+              <w:top w:w="80" w:type="dxa"/>
+              <w:left w:w="140" w:type="dxa"/>
+              <w:bottom w:w="80" w:type="dxa"/>
+              <w:right w:w="140" w:type="dxa"/>
+            </w:tcMar>
+            <w:vAlign w:val="center"/>
+          </w:tcPr>
+          <w:p>
+            <w:pPr>
+              <w:jc w:val="center"/>
+            </w:pPr>
+            <w:r>
+              <w:rPr>
+                <w:color w:val="000000"/>
+                <w:sz w:val="20"/>
+                <w:szCs w:val="20"/>
+              </w:rPr>
+              <w:t>Vehicle rates</w:t>
+            </w:r>
+          </w:p>
+        </w:tc>
+      </w:tr>
+      <w:tr>
+        <w:tc>
+          <w:tcPr>
+            <w:tcW w:w="2000" w:type="dxa"/>
+            <w:tcBorders>
+              <w:top w:val="single" w:sz="4" w:space="0" w:color="CCCCCC"/>
+              <w:left w:val="single" w:sz="4" w:space="0" w:color="CCCCCC"/>
+              <w:bottom w:val="single" w:sz="4" w:space="0" w:color="CCCCCC"/>
+              <w:right w:val="single" w:sz="4" w:space="0" w:color="CCCCCC"/>
+            </w:tcBorders>
+            <w:shd w:val="clear" w:color="auto" w:fill="EBF3FB"/>
+            <w:tcMar>
+              <w:top w:w="80" w:type="dxa"/>
+              <w:left w:w="140" w:type="dxa"/>
+              <w:bottom w:w="80" w:type="dxa"/>
+              <w:right w:w="140" w:type="dxa"/>
+            </w:tcMar>
+            <w:vAlign w:val="center"/>
+          </w:tcPr>
+          <w:p>
+            <w:pPr>
+              <w:jc w:val="center"/>
+            </w:pPr>
+            <w:r>
+              <w:rPr>
+                <w:b/>
+                <w:bCs/>
+                <w:color w:val="1A5276"/>
+                <w:sz w:val="20"/>
+                <w:szCs w:val="20"/>
+              </w:rPr>
+              <w:t>PARKING_SPOTS</w:t>
+            </w:r>
+          </w:p>
+        </w:tc>
+        <w:tc>
+          <w:tcPr>
+            <w:tcW w:w="7360" w:type="dxa"/>
+            <w:tcBorders>
+              <w:top w:val="single" w:sz="4" w:space="0" w:color="CCCCCC"/>
+              <w:left w:val="single" w:sz="4" w:space="0" w:color="CCCCCC"/>
+              <w:bottom w:val="single" w:sz="4" w:space="0" w:color="CCCCCC"/>
+              <w:right w:val="single" w:sz="4" w:space="0" w:color="CCCCCC"/>
+            </w:tcBorders>
+            <w:shd w:val="clear" w:color="auto" w:fill="EBF3FB"/>
+            <w:tcMar>
+              <w:top w:w="80" w:type="dxa"/>
+              <w:left w:w="140" w:type="dxa"/>
+              <w:bottom w:w="80" w:type="dxa"/>
+              <w:right w:w="140" w:type="dxa"/>
+            </w:tcMar>
+            <w:vAlign w:val="center"/>
+          </w:tcPr>
+          <w:p>
+            <w:pPr>
+              <w:jc w:val="center"/>
+            </w:pPr>
+            <w:r>
+              <w:rPr>
+                <w:color w:val="000000"/>
+                <w:sz w:val="20"/>
+                <w:szCs w:val="20"/>
+              </w:rPr>
+              <w:t>Physical spots</w:t>
+            </w:r>
+          </w:p>
+        </w:tc>
+      </w:tr>
+      <w:tr>
+        <w:tc>
+          <w:tcPr>
+            <w:tcW w:w="2000" w:type="dxa"/>
+            <w:tcBorders>
+              <w:top w:val="single" w:sz="4" w:space="0" w:color="CCCCCC"/>
+              <w:left w:val="single" w:sz="4" w:space="0" w:color="CCCCCC"/>
+              <w:bottom w:val="single" w:sz="4" w:space="0" w:color="CCCCCC"/>
+              <w:right w:val="single" w:sz="4" w:space="0" w:color="CCCCCC"/>
+            </w:tcBorders>
+            <w:shd w:val="clear" w:color="auto" w:fill="FFFFFF"/>
+            <w:tcMar>
+              <w:top w:w="80" w:type="dxa"/>
+              <w:left w:w="140" w:type="dxa"/>
+              <w:bottom w:w="80" w:type="dxa"/>
+              <w:right w:w="140" w:type="dxa"/>
+            </w:tcMar>
+            <w:vAlign w:val="center"/>
+          </w:tcPr>
+          <w:p>
+            <w:pPr>
+              <w:jc w:val="center"/>
+            </w:pPr>
+            <w:r>
+              <w:rPr>
+                <w:b/>
+                <w:bCs/>
+                <w:color w:val="1A5276"/>
+                <w:sz w:val="20"/>
+                <w:szCs w:val="20"/>
+              </w:rPr>
+              <w:t>RESERVATIONS</w:t>
+            </w:r>
+          </w:p>
+        </w:tc>
+        <w:tc>
+          <w:tcPr>
+            <w:tcW w:w="7360" w:type="dxa"/>
+            <w:tcBorders>
+              <w:top w:val="single" w:sz="4" w:space="0" w:color="CCCCCC"/>
+              <w:left w:val="single" w:sz="4" w:space="0" w:color="CCCCCC"/>
+              <w:bottom w:val="single" w:sz="4" w:space="0" w:color="CCCCCC"/>
+              <w:right w:val="single" w:sz="4" w:space="0" w:color="CCCCCC"/>
+            </w:tcBorders>
+            <w:shd w:val="clear" w:color="auto" w:fill="FFFFFF"/>
+            <w:tcMar>
+              <w:top w:w="80" w:type="dxa"/>
+              <w:left w:w="140" w:type="dxa"/>
+              <w:bottom w:w="80" w:type="dxa"/>
+              <w:right w:w="140" w:type="dxa"/>
+            </w:tcMar>
+            <w:vAlign w:val="center"/>
+          </w:tcPr>
+          <w:p>
+            <w:pPr>
+              <w:jc w:val="center"/>
+              <w:rPr>
+                <w:sz w:val="20"/>
+                <w:szCs w:val="20"/>
+              </w:rPr>
+            </w:pPr>
+            <w:r>
+              <w:rPr>
+                <w:sz w:val="20"/>
+                <w:szCs w:val="20"/>
+              </w:rPr>
+              <w:t>Booking records</w:t>
+            </w:r>
+          </w:p>
+        </w:tc>
+      </w:tr>
+      <w:tr>
+        <w:tc>
+          <w:tcPr>
+            <w:tcW w:w="2000" w:type="dxa"/>
+            <w:tcBorders>
+              <w:top w:val="single" w:sz="4" w:space="0" w:color="CCCCCC"/>
+              <w:left w:val="single" w:sz="4" w:space="0" w:color="CCCCCC"/>
+              <w:bottom w:val="single" w:sz="4" w:space="0" w:color="CCCCCC"/>
+              <w:right w:val="single" w:sz="4" w:space="0" w:color="CCCCCC"/>
+            </w:tcBorders>
+            <w:shd w:val="clear" w:color="auto" w:fill="EBF3FB"/>
+            <w:tcMar>
+              <w:top w:w="80" w:type="dxa"/>
+              <w:left w:w="140" w:type="dxa"/>
+              <w:bottom w:w="80" w:type="dxa"/>
+              <w:right w:w="140" w:type="dxa"/>
+            </w:tcMar>
+            <w:vAlign w:val="center"/>
+          </w:tcPr>
+          <w:p>
+            <w:pPr>
+              <w:jc w:val="center"/>
+            </w:pPr>
+            <w:r>
+              <w:rPr>
+                <w:b/>
+                <w:bCs/>
+                <w:color w:val="1A5276"/>
+                <w:sz w:val="20"/>
+                <w:szCs w:val="20"/>
+              </w:rPr>
+              <w:t>VIOLATIONS</w:t>
+            </w:r>
+          </w:p>
+        </w:tc>
+        <w:tc>
+          <w:tcPr>
+            <w:tcW w:w="7360" w:type="dxa"/>
+            <w:tcBorders>
+              <w:top w:val="single" w:sz="4" w:space="0" w:color="CCCCCC"/>
+              <w:left w:val="single" w:sz="4" w:space="0" w:color="CCCCCC"/>
+              <w:bottom w:val="single" w:sz="4" w:space="0" w:color="CCCCCC"/>
+              <w:right w:val="single" w:sz="4" w:space="0" w:color="CCCCCC"/>
+            </w:tcBorders>
+            <w:shd w:val="clear" w:color="auto" w:fill="EBF3FB"/>
+            <w:tcMar>
+              <w:top w:w="80" w:type="dxa"/>
+              <w:left w:w="140" w:type="dxa"/>
+              <w:bottom w:w="80" w:type="dxa"/>
+              <w:right w:w="140" w:type="dxa"/>
+            </w:tcMar>
+            <w:vAlign w:val="center"/>
+          </w:tcPr>
+          <w:p>
+            <w:pPr>
+              <w:jc w:val="center"/>
+            </w:pPr>
+            <w:r>
+              <w:rPr>
+                <w:color w:val="000000"/>
+                <w:sz w:val="20"/>
+                <w:szCs w:val="20"/>
+              </w:rPr>
+              <w:t>Overstay fines</w:t>
+            </w:r>
+          </w:p>
+        </w:tc>
+      </w:tr>
+      <w:tr>
+        <w:tc>
+          <w:tcPr>
+            <w:tcW w:w="2000" w:type="dxa"/>
+            <w:tcBorders>
+              <w:top w:val="single" w:sz="4" w:space="0" w:color="CCCCCC"/>
+              <w:left w:val="single" w:sz="4" w:space="0" w:color="CCCCCC"/>
+              <w:bottom w:val="single" w:sz="4" w:space="0" w:color="CCCCCC"/>
+              <w:right w:val="single" w:sz="4" w:space="0" w:color="CCCCCC"/>
+            </w:tcBorders>
+            <w:shd w:val="clear" w:color="auto" w:fill="FFFFFF"/>
+            <w:tcMar>
+              <w:top w:w="80" w:type="dxa"/>
+              <w:left w:w="140" w:type="dxa"/>
+              <w:bottom w:w="80" w:type="dxa"/>
+              <w:right w:w="140" w:type="dxa"/>
+            </w:tcMar>
+            <w:vAlign w:val="center"/>
+          </w:tcPr>
+          <w:p>
+            <w:pPr>
+              <w:jc w:val="center"/>
+            </w:pPr>
+            <w:r>
+              <w:rPr>
+                <w:b/>
+                <w:bCs/>
+                <w:color w:val="1A5276"/>
+                <w:sz w:val="20"/>
+                <w:szCs w:val="20"/>
+              </w:rPr>
+              <w:t>LOYALTY_POINTS</w:t>
+            </w:r>
+          </w:p>
+        </w:tc>
+        <w:tc>
+          <w:tcPr>
+            <w:tcW w:w="7360" w:type="dxa"/>
+            <w:tcBorders>
+              <w:top w:val="single" w:sz="4" w:space="0" w:color="CCCCCC"/>
+              <w:left w:val="single" w:sz="4" w:space="0" w:color="CCCCCC"/>
+              <w:bottom w:val="single" w:sz="4" w:space="0" w:color="CCCCCC"/>
+              <w:right w:val="single" w:sz="4" w:space="0" w:color="CCCCCC"/>
+            </w:tcBorders>
+            <w:shd w:val="clear" w:color="auto" w:fill="FFFFFF"/>
+            <w:tcMar>
+              <w:top w:w="80" w:type="dxa"/>
+              <w:left w:w="140" w:type="dxa"/>
+              <w:bottom w:w="80" w:type="dxa"/>
+              <w:right w:w="140" w:type="dxa"/>
+            </w:tcMar>
+            <w:vAlign w:val="center"/>
+          </w:tcPr>
+          <w:p>
+            <w:pPr>
+              <w:jc w:val="center"/>
+            </w:pPr>
+            <w:r>
+              <w:rPr>
+                <w:color w:val="000000"/>
+                <w:sz w:val="20"/>
+                <w:szCs w:val="20"/>
+              </w:rPr>
+              <w:t>Points balance</w:t>
+            </w:r>
+          </w:p>
+        </w:tc>
+      </w:tr>
+      <w:tr>
+        <w:tc>
+          <w:tcPr>
+            <w:tcW w:w="2000" w:type="dxa"/>
+            <w:tcBorders>
+              <w:top w:val="single" w:sz="4" w:space="0" w:color="CCCCCC"/>
+              <w:left w:val="single" w:sz="4" w:space="0" w:color="CCCCCC"/>
+              <w:bottom w:val="single" w:sz="4" w:space="0" w:color="CCCCCC"/>
+              <w:right w:val="single" w:sz="4" w:space="0" w:color="CCCCCC"/>
+            </w:tcBorders>
+            <w:shd w:val="clear" w:color="auto" w:fill="EBF3FB"/>
+            <w:tcMar>
+              <w:top w:w="80" w:type="dxa"/>
+              <w:left w:w="140" w:type="dxa"/>
+              <w:bottom w:w="80" w:type="dxa"/>
+              <w:right w:w="140" w:type="dxa"/>
+            </w:tcMar>
+            <w:vAlign w:val="center"/>
+          </w:tcPr>
+          <w:p>
+            <w:pPr>
+              <w:jc w:val="center"/>
+            </w:pPr>
+            <w:r>
+              <w:rPr>
+                <w:b/>
+                <w:bCs/>
+                <w:color w:val="1A5276"/>
+                <w:sz w:val="20"/>
+                <w:szCs w:val="20"/>
+              </w:rPr>
+              <w:t>TRANSACTIONS</w:t>
+            </w:r>
+          </w:p>
+        </w:tc>
+        <w:tc>
+          <w:tcPr>
+            <w:tcW w:w="7360" w:type="dxa"/>
+            <w:tcBorders>
+              <w:top w:val="single" w:sz="4" w:space="0" w:color="CCCCCC"/>
+              <w:left w:val="single" w:sz="4" w:space="0" w:color="CCCCCC"/>
+              <w:bottom w:val="single" w:sz="4" w:space="0" w:color="CCCCCC"/>
+              <w:right w:val="single" w:sz="4" w:space="0" w:color="CCCCCC"/>
+            </w:tcBorders>
+            <w:shd w:val="clear" w:color="auto" w:fill="EBF3FB"/>
+            <w:tcMar>
+              <w:top w:w="80" w:type="dxa"/>
+              <w:left w:w="140" w:type="dxa"/>
+              <w:bottom w:w="80" w:type="dxa"/>
+              <w:right w:w="140" w:type="dxa"/>
+            </w:tcMar>
+            <w:vAlign w:val="center"/>
+          </w:tcPr>
+          <w:p>
+            <w:pPr>
+              <w:jc w:val="center"/>
+              <w:rPr>
+                <w:sz w:val="20"/>
+                <w:szCs w:val="20"/>
+              </w:rPr>
+            </w:pPr>
+            <w:r>
+              <w:rPr>
+                <w:sz w:val="20"/>
+                <w:szCs w:val="20"/>
+              </w:rPr>
+              <w:t>Points history</w:t>
+            </w:r>
+          </w:p>
+        </w:tc>
+      </w:tr>
+      <w:tr>
+        <w:tc>
+          <w:tcPr>
+            <w:tcW w:w="2000" w:type="dxa"/>
+            <w:tcBorders>
+              <w:top w:val="single" w:sz="4" w:space="0" w:color="CCCCCC"/>
+              <w:left w:val="single" w:sz="4" w:space="0" w:color="CCCCCC"/>
+              <w:bottom w:val="single" w:sz="4" w:space="0" w:color="CCCCCC"/>
+              <w:right w:val="single" w:sz="4" w:space="0" w:color="CCCCCC"/>
+            </w:tcBorders>
+            <w:shd w:val="clear" w:color="auto" w:fill="FFFFFF"/>
+            <w:tcMar>
+              <w:top w:w="80" w:type="dxa"/>
+              <w:left w:w="140" w:type="dxa"/>
+              <w:bottom w:w="80" w:type="dxa"/>
+              <w:right w:w="140" w:type="dxa"/>
+            </w:tcMar>
+            <w:vAlign w:val="center"/>
+          </w:tcPr>
+          <w:p>
+            <w:pPr>
+              <w:jc w:val="center"/>
+            </w:pPr>
+            <w:r>
+              <w:rPr>
+                <w:b/>
+                <w:bCs/>
+                <w:color w:val="1A5276"/>
+                <w:sz w:val="20"/>
+                <w:szCs w:val="20"/>
+              </w:rPr>
+              <w:t>DISCOUNTS</w:t>
+            </w:r>
+          </w:p>
+        </w:tc>
+        <w:tc>
+          <w:tcPr>
+            <w:tcW w:w="7360" w:type="dxa"/>
+            <w:tcBorders>
+              <w:top w:val="single" w:sz="4" w:space="0" w:color="CCCCCC"/>
+              <w:left w:val="single" w:sz="4" w:space="0" w:color="CCCCCC"/>
+              <w:bottom w:val="single" w:sz="4" w:space="0" w:color="CCCCCC"/>
+              <w:right w:val="single" w:sz="4" w:space="0" w:color="CCCCCC"/>
+            </w:tcBorders>
+            <w:shd w:val="clear" w:color="auto" w:fill="FFFFFF"/>
+            <w:tcMar>
+              <w:top w:w="80" w:type="dxa"/>
+              <w:left w:w="140" w:type="dxa"/>
+              <w:bottom w:w="80" w:type="dxa"/>
+              <w:right w:w="140" w:type="dxa"/>
+            </w:tcMar>
+            <w:vAlign w:val="center"/>
+          </w:tcPr>
+          <w:p>
+            <w:pPr>
+              <w:jc w:val="center"/>
+            </w:pPr>
+            <w:r>
+              <w:rPr>
+                <w:color w:val="000000"/>
+                <w:sz w:val="20"/>
+                <w:szCs w:val="20"/>
+              </w:rPr>
+              <w:t>Discount coupons</w:t>
+            </w:r>
+          </w:p>
+        </w:tc>
+      </w:tr>
+      <w:tr>
+        <w:tc>
+          <w:tcPr>
+            <w:tcW w:w="2000" w:type="dxa"/>
+            <w:tcBorders>
+              <w:top w:val="single" w:sz="4" w:space="0" w:color="CCCCCC"/>
+              <w:left w:val="single" w:sz="4" w:space="0" w:color="CCCCCC"/>
+              <w:bottom w:val="single" w:sz="4" w:space="0" w:color="CCCCCC"/>
+              <w:right w:val="single" w:sz="4" w:space="0" w:color="CCCCCC"/>
+            </w:tcBorders>
+            <w:shd w:val="clear" w:color="auto" w:fill="EBF3FB"/>
+            <w:tcMar>
+              <w:top w:w="80" w:type="dxa"/>
+              <w:left w:w="140" w:type="dxa"/>
+              <w:bottom w:w="80" w:type="dxa"/>
+              <w:right w:w="140" w:type="dxa"/>
+            </w:tcMar>
+            <w:vAlign w:val="center"/>
+          </w:tcPr>
+          <w:p>
+            <w:pPr>
+              <w:jc w:val="center"/>
+            </w:pPr>
+            <w:r>
+              <w:rPr>
+                <w:b/>
+                <w:bCs/>
+                <w:color w:val="1A5276"/>
+                <w:sz w:val="20"/>
+                <w:szCs w:val="20"/>
+              </w:rPr>
+              <w:t>WALLET_TRANSACTIONS</w:t>
+            </w:r>
+          </w:p>
+        </w:tc>
+        <w:tc>
+          <w:tcPr>
+            <w:tcW w:w="7360" w:type="dxa"/>
+            <w:tcBorders>
+              <w:top w:val="single" w:sz="4" w:space="0" w:color="CCCCCC"/>
+              <w:left w:val="single" w:sz="4" w:space="0" w:color="CCCCCC"/>
+              <w:bottom w:val="single" w:sz="4" w:space="0" w:color="CCCCCC"/>
+              <w:right w:val="single" w:sz="4" w:space="0" w:color="CCCCCC"/>
+            </w:tcBorders>
+            <w:shd w:val="clear" w:color="auto" w:fill="EBF3FB"/>
+            <w:tcMar>
+              <w:top w:w="80" w:type="dxa"/>
+              <w:left w:w="140" w:type="dxa"/>
+              <w:bottom w:w="80" w:type="dxa"/>
+              <w:right w:w="140" w:type="dxa"/>
+            </w:tcMar>
+            <w:vAlign w:val="center"/>
+          </w:tcPr>
+          <w:p>
+            <w:pPr>
+              <w:jc w:val="center"/>
+              <w:rPr>
+                <w:sz w:val="20"/>
+                <w:szCs w:val="20"/>
+              </w:rPr>
+            </w:pPr>
+            <w:r>
+              <w:rPr>
+                <w:sz w:val="20"/>
+                <w:szCs w:val="20"/>
+              </w:rPr>
+              <w:t>Wallet history</w:t>
+            </w:r>
+          </w:p>
+        </w:tc>
+      </w:tr>
+    </w:tbl>
+    <w:p>
+      <w:pPr>
+        <w:spacing w:after="80"/>
+      </w:pPr>
+    </w:p>
+    <w:p>
+      <w:pPr>
+        <w:spacing w:after="140" w:line="288" w:lineRule="auto"/>
+        <w:jc w:val="both"/>
+      </w:pPr>
+      <w:r>
+        <w:rPr>
+          <w:i/>
+          <w:iCs/>
+          <w:color w:val="555555"/>
+          <w:sz w:val="20"/>
+          <w:szCs w:val="20"/>
+        </w:rPr>
+        <w:t>Table 1: Overview of all 9 database tables and their purpose.</w:t>
+      </w:r>
+    </w:p>
+    <w:p>
+      <w:pPr>
+        <w:spacing w:after="80"/>
+      </w:pPr>
+    </w:p>
+    <w:p>
+      <w:pPr>
+        <w:pStyle w:val="Heading2"/>
+      </w:pPr>
+      <w:bookmarkStart w:id="55" w:name="_Toc229261693"/>
+      <w:r>
+        <w:t>2.3 Key Database Constraints</w:t>
+      </w:r>
+      <w:bookmarkEnd w:id="55"/>
+    </w:p>
+    <w:p>
+      <w:pPr>
+        <w:spacing w:after="40"/>
+      </w:pPr>
+    </w:p>
+    <w:tbl>
+      <w:tblPr>
+        <w:tblW w:w="9351" w:type="dxa"/>
+        <w:tblBorders>
+          <w:top w:val="single" w:sz="4" w:space="0" w:color="auto"/>
+          <w:left w:val="single" w:sz="4" w:space="0" w:color="auto"/>
+          <w:bottom w:val="single" w:sz="4" w:space="0" w:color="auto"/>
+          <w:right w:val="single" w:sz="4" w:space="0" w:color="auto"/>
+          <w:insideH w:val="single" w:sz="4" w:space="0" w:color="auto"/>
+          <w:insideV w:val="single" w:sz="4" w:space="0" w:color="auto"/>
+        </w:tblBorders>
+        <w:tblCellMar>
+          <w:left w:w="10" w:type="dxa"/>
+          <w:right w:w="10" w:type="dxa"/>
+        </w:tblCellMar>
+        <w:tblLook w:val="04A0" w:firstRow="1" w:lastRow="0" w:firstColumn="1" w:lastColumn="0" w:noHBand="0" w:noVBand="1"/>
+      </w:tblPr>
+      <w:tblGrid>
+        <w:gridCol w:w="9351"/>
+      </w:tblGrid>
+      <w:tr>
+        <w:trPr>
+          <w:tblHeader/>
+        </w:trPr>
+        <w:tc>
+          <w:tcPr>
+            <w:tcW w:w="9351" w:type="dxa"/>
+            <w:tcBorders>
+              <w:top w:val="single" w:sz="4" w:space="0" w:color="1A5276"/>
+              <w:left w:val="single" w:sz="4" w:space="0" w:color="1A5276"/>
+              <w:bottom w:val="single" w:sz="4" w:space="0" w:color="1A5276"/>
+              <w:right w:val="single" w:sz="4" w:space="0" w:color="1A5276"/>
+            </w:tcBorders>
+            <w:shd w:val="clear" w:color="auto" w:fill="1A5276"/>
+            <w:tcMar>
+              <w:top w:w="100" w:type="dxa"/>
+              <w:left w:w="140" w:type="dxa"/>
+              <w:bottom w:w="100" w:type="dxa"/>
+              <w:right w:w="140" w:type="dxa"/>
+            </w:tcMar>
+            <w:vAlign w:val="center"/>
+          </w:tcPr>
+          <w:p>
+            <w:pPr>
+              <w:jc w:val="center"/>
+            </w:pPr>
+            <w:r>
+              <w:rPr>
+                <w:rFonts w:ascii="Arial" w:eastAsia="Arial" w:hAnsi="Arial" w:cs="Arial"/>
+                <w:b/>
+                <w:bCs/>
+                <w:color w:val="FFFFFF"/>
+                <w:sz w:val="20"/>
+                <w:szCs w:val="20"/>
+              </w:rPr>
+              <w:t>Rules</w:t>
+            </w:r>
+          </w:p>
+        </w:tc>
+      </w:tr>
+      <w:tr>
+        <w:tc>
+          <w:tcPr>
+            <w:tcW w:w="9351" w:type="dxa"/>
+            <w:tcBorders>
+              <w:top w:val="single" w:sz="4" w:space="0" w:color="CCCCCC"/>
+              <w:left w:val="single" w:sz="4" w:space="0" w:color="CCCCCC"/>
+              <w:bottom w:val="single" w:sz="4" w:space="0" w:color="CCCCCC"/>
+              <w:right w:val="single" w:sz="4" w:space="0" w:color="CCCCCC"/>
+            </w:tcBorders>
+            <w:shd w:val="clear" w:color="auto" w:fill="FFFFFF"/>
+            <w:tcMar>
+              <w:top w:w="80" w:type="dxa"/>
+              <w:left w:w="140" w:type="dxa"/>
+              <w:bottom w:w="80" w:type="dxa"/>
+              <w:right w:w="140" w:type="dxa"/>
+            </w:tcMar>
+            <w:vAlign w:val="center"/>
+          </w:tcPr>
+          <w:p>
+            <w:pPr>
+              <w:jc w:val="center"/>
+              <w:rPr>
+                <w:sz w:val="22"/>
+                <w:szCs w:val="22"/>
+              </w:rPr>
+            </w:pPr>
+            <w:r>
+              <w:rPr>
+                <w:color w:val="000000"/>
+                <w:sz w:val="22"/>
+                <w:szCs w:val="22"/>
+              </w:rPr>
+              <w:t>No double-booking the same spot</w:t>
+            </w:r>
+          </w:p>
+        </w:tc>
+      </w:tr>
+      <w:tr>
+        <w:tc>
+          <w:tcPr>
+            <w:tcW w:w="9351" w:type="dxa"/>
+            <w:tcBorders>
+              <w:top w:val="single" w:sz="4" w:space="0" w:color="CCCCCC"/>
+              <w:left w:val="single" w:sz="4" w:space="0" w:color="CCCCCC"/>
+              <w:bottom w:val="single" w:sz="4" w:space="0" w:color="CCCCCC"/>
+              <w:right w:val="single" w:sz="4" w:space="0" w:color="CCCCCC"/>
+            </w:tcBorders>
+            <w:shd w:val="clear" w:color="auto" w:fill="EBF3FB"/>
+            <w:tcMar>
+              <w:top w:w="80" w:type="dxa"/>
+              <w:left w:w="140" w:type="dxa"/>
+              <w:bottom w:w="80" w:type="dxa"/>
+              <w:right w:w="140" w:type="dxa"/>
+            </w:tcMar>
+            <w:vAlign w:val="center"/>
+          </w:tcPr>
+          <w:p>
+            <w:pPr>
+              <w:jc w:val="center"/>
+              <w:rPr>
+                <w:sz w:val="22"/>
+                <w:szCs w:val="22"/>
+              </w:rPr>
+            </w:pPr>
+            <w:r>
+              <w:rPr>
+                <w:color w:val="000000"/>
+                <w:sz w:val="22"/>
+                <w:szCs w:val="22"/>
+              </w:rPr>
+              <w:t>end time must be after start time</w:t>
+            </w:r>
+          </w:p>
+        </w:tc>
+      </w:tr>
+      <w:tr>
+        <w:tc>
+          <w:tcPr>
+            <w:tcW w:w="9351" w:type="dxa"/>
+            <w:tcBorders>
+              <w:top w:val="single" w:sz="4" w:space="0" w:color="CCCCCC"/>
+              <w:left w:val="single" w:sz="4" w:space="0" w:color="CCCCCC"/>
+              <w:bottom w:val="single" w:sz="4" w:space="0" w:color="CCCCCC"/>
+              <w:right w:val="single" w:sz="4" w:space="0" w:color="CCCCCC"/>
+            </w:tcBorders>
+            <w:shd w:val="clear" w:color="auto" w:fill="FFFFFF"/>
+            <w:tcMar>
+              <w:top w:w="80" w:type="dxa"/>
+              <w:left w:w="140" w:type="dxa"/>
+              <w:bottom w:w="80" w:type="dxa"/>
+              <w:right w:w="140" w:type="dxa"/>
+            </w:tcMar>
+            <w:vAlign w:val="center"/>
+          </w:tcPr>
+          <w:p>
+            <w:pPr>
+              <w:jc w:val="center"/>
+              <w:rPr>
+                <w:sz w:val="22"/>
+                <w:szCs w:val="22"/>
+              </w:rPr>
+            </w:pPr>
+            <w:r>
+              <w:rPr>
+                <w:color w:val="000000"/>
+                <w:sz w:val="22"/>
+                <w:szCs w:val="22"/>
+              </w:rPr>
+              <w:t>Wallet cannot go below zero</w:t>
+            </w:r>
+          </w:p>
+        </w:tc>
+      </w:tr>
+      <w:tr>
+        <w:tc>
+          <w:tcPr>
+            <w:tcW w:w="9351" w:type="dxa"/>
+            <w:tcBorders>
+              <w:top w:val="single" w:sz="4" w:space="0" w:color="CCCCCC"/>
+              <w:left w:val="single" w:sz="4" w:space="0" w:color="CCCCCC"/>
+              <w:bottom w:val="single" w:sz="4" w:space="0" w:color="CCCCCC"/>
+              <w:right w:val="single" w:sz="4" w:space="0" w:color="CCCCCC"/>
+            </w:tcBorders>
+            <w:shd w:val="clear" w:color="auto" w:fill="EBF3FB"/>
+            <w:tcMar>
+              <w:top w:w="80" w:type="dxa"/>
+              <w:left w:w="140" w:type="dxa"/>
+              <w:bottom w:w="80" w:type="dxa"/>
+              <w:right w:w="140" w:type="dxa"/>
+            </w:tcMar>
+            <w:vAlign w:val="center"/>
+          </w:tcPr>
+          <w:p>
+            <w:pPr>
+              <w:jc w:val="center"/>
+              <w:rPr>
+                <w:sz w:val="22"/>
+                <w:szCs w:val="22"/>
+              </w:rPr>
+            </w:pPr>
+            <w:r>
+              <w:rPr>
+                <w:color w:val="000000"/>
+                <w:sz w:val="22"/>
+                <w:szCs w:val="22"/>
+              </w:rPr>
+              <w:t>Discount code is single use only</w:t>
+            </w:r>
+          </w:p>
+        </w:tc>
+      </w:tr>
+      <w:tr>
+        <w:tc>
+          <w:tcPr>
+            <w:tcW w:w="9351" w:type="dxa"/>
+            <w:tcBorders>
+              <w:top w:val="single" w:sz="4" w:space="0" w:color="CCCCCC"/>
+              <w:left w:val="single" w:sz="4" w:space="0" w:color="CCCCCC"/>
+              <w:bottom w:val="single" w:sz="4" w:space="0" w:color="CCCCCC"/>
+              <w:right w:val="single" w:sz="4" w:space="0" w:color="CCCCCC"/>
+            </w:tcBorders>
+            <w:shd w:val="clear" w:color="auto" w:fill="FFFFFF"/>
+            <w:tcMar>
+              <w:top w:w="80" w:type="dxa"/>
+              <w:left w:w="140" w:type="dxa"/>
+              <w:bottom w:w="80" w:type="dxa"/>
+              <w:right w:w="140" w:type="dxa"/>
+            </w:tcMar>
+            <w:vAlign w:val="center"/>
+          </w:tcPr>
+          <w:p>
+            <w:pPr>
+              <w:jc w:val="center"/>
+              <w:rPr>
+                <w:sz w:val="22"/>
+                <w:szCs w:val="22"/>
+              </w:rPr>
+            </w:pPr>
+            <w:r>
+              <w:rPr>
+                <w:color w:val="000000"/>
+                <w:sz w:val="22"/>
+                <w:szCs w:val="22"/>
+              </w:rPr>
+              <w:t>Email and referral code must be unique</w:t>
+            </w:r>
+          </w:p>
+        </w:tc>
+      </w:tr>
+      <w:tr>
+        <w:tc>
+          <w:tcPr>
+            <w:tcW w:w="9351" w:type="dxa"/>
+            <w:tcBorders>
+              <w:top w:val="single" w:sz="4" w:space="0" w:color="CCCCCC"/>
+              <w:left w:val="single" w:sz="4" w:space="0" w:color="CCCCCC"/>
+              <w:bottom w:val="single" w:sz="4" w:space="0" w:color="CCCCCC"/>
+              <w:right w:val="single" w:sz="4" w:space="0" w:color="CCCCCC"/>
+            </w:tcBorders>
+            <w:shd w:val="clear" w:color="auto" w:fill="EBF3FB"/>
+            <w:tcMar>
+              <w:top w:w="80" w:type="dxa"/>
+              <w:left w:w="140" w:type="dxa"/>
+              <w:bottom w:w="80" w:type="dxa"/>
+              <w:right w:w="140" w:type="dxa"/>
+            </w:tcMar>
+            <w:vAlign w:val="center"/>
+          </w:tcPr>
+          <w:p>
+            <w:pPr>
+              <w:jc w:val="center"/>
+              <w:rPr>
+                <w:sz w:val="22"/>
+                <w:szCs w:val="22"/>
+              </w:rPr>
+            </w:pPr>
+            <w:r>
+              <w:rPr>
+                <w:color w:val="000000"/>
+                <w:sz w:val="22"/>
+                <w:szCs w:val="22"/>
+              </w:rPr>
+              <w:t>Overstay fine issued only once per booking</w:t>
+            </w:r>
+          </w:p>
+        </w:tc>
+      </w:tr>
+    </w:tbl>
+    <w:p>
+      <w:pPr>
+        <w:spacing w:after="80"/>
+      </w:pPr>
+    </w:p>
+    <w:p>
+      <w:pPr>
+        <w:spacing w:after="140" w:line="288" w:lineRule="auto"/>
+      </w:pPr>
+      <w:r>
+        <w:rPr>
+          <w:i/>
+          <w:iCs/>
+          <w:color w:val="555555"/>
+          <w:sz w:val="20"/>
+          <w:szCs w:val="20"/>
+        </w:rPr>
+        <w:t>Table 2: Key database business rules.</w:t>
+      </w:r>
+    </w:p>
+    <w:p>
+      <w:pPr>
+        <w:spacing w:after="100"/>
+      </w:pPr>
+    </w:p>
+    <w:p>
+      <w:pPr>
+        <w:pStyle w:val="Heading2"/>
+        <w:pBdr>
+          <w:bottom w:val="single" w:sz="10" w:space="4" w:color="2E4DA0"/>
+        </w:pBdr>
+      </w:pPr>
+    </w:p>
+    <w:p>
+      <w:pPr>
+        <w:pStyle w:val="Heading2"/>
+        <w:pBdr>
+          <w:bottom w:val="single" w:sz="10" w:space="4" w:color="2E4DA0"/>
+        </w:pBdr>
+      </w:pPr>
+    </w:p>
+    <w:p>
+      <w:pPr>
+        <w:pStyle w:val="Heading2"/>
+        <w:pBdr>
+          <w:bottom w:val="single" w:sz="10" w:space="4" w:color="2E4DA0"/>
+        </w:pBdr>
+      </w:pPr>
+    </w:p>
+    <w:p>
+      <w:pPr>
+        <w:pStyle w:val="Heading2"/>
+        <w:pBdr>
+          <w:bottom w:val="single" w:sz="10" w:space="4" w:color="2E4DA0"/>
+        </w:pBdr>
+      </w:pPr>
+    </w:p>
+    <w:p>
+      <w:pPr>
+        <w:pStyle w:val="Heading2"/>
+        <w:pBdr>
+          <w:bottom w:val="single" w:sz="10" w:space="4" w:color="2E4DA0"/>
+        </w:pBdr>
+      </w:pPr>
+    </w:p>
+    <w:p>
+      <w:pPr>
+        <w:pStyle w:val="Heading2"/>
+      </w:pPr>
+      <w:bookmarkStart w:id="56" w:name="_Toc229261694"/>
+      <w:r>
+        <w:lastRenderedPageBreak/>
+        <w:t>2.4 Entity-Relationship Diagram</w:t>
+      </w:r>
+      <w:bookmarkEnd w:id="56"/>
+    </w:p>
+    <w:p>
+      <w:pPr>
+        <w:spacing w:after="140" w:line="288" w:lineRule="auto"/>
+        <w:jc w:val="center"/>
+      </w:pPr>
+      <w:r>
+        <w:rPr>
+          <w:noProof/>
+        </w:rPr>
+        <w:drawing>
+          <wp:inline distT="0" distB="0" distL="114300" distR="114300" wp14:anchorId="223A46B7" wp14:editId="30B7AB54">
+            <wp:extent cx="3657600" cy="6250638"/>
+            <wp:effectExtent l="0" t="0" r="0" b="0"/>
+            <wp:docPr id="101" name="ERD_Diagram"/>
+            <wp:cNvGraphicFramePr>
+              <a:graphicFrameLocks xmlns:a="http://schemas.openxmlformats.org/drawingml/2006/main" noChangeAspect="1"/>
+            </wp:cNvGraphicFramePr>
+            <a:graphic xmlns:a="http://schemas.openxmlformats.org/drawingml/2006/main">
+              <a:graphicData uri="http://schemas.openxmlformats.org/drawingml/2006/picture">
+                <pic:pic xmlns:pic="http://schemas.openxmlformats.org/drawingml/2006/picture">
+                  <pic:nvPicPr>
+                    <pic:cNvPr id="101" name="ERD_Diagram"/>
+                    <pic:cNvPicPr/>
+                  </pic:nvPicPr>
+                  <pic:blipFill>
+                    <a:blip r:embed="rId13"/>
+                    <a:stretch>
+                      <a:fillRect/>
+                    </a:stretch>
+                  </pic:blipFill>
+                  <pic:spPr>
+                    <a:xfrm>
+                      <a:off x="0" y="0"/>
+                      <a:ext cx="3657600" cy="6250638"/>
+                    </a:xfrm>
+                    <a:prstGeom prst="rect">
+                      <a:avLst/>
+                    </a:prstGeom>
+                  </pic:spPr>
+                </pic:pic>
+              </a:graphicData>
+            </a:graphic>
+          </wp:inline>
+        </w:drawing>
+      </w:r>
+    </w:p>
+    <w:p>
+      <w:pPr>
+        <w:spacing w:after="140" w:line="288" w:lineRule="auto"/>
+        <w:jc w:val="center"/>
+      </w:pPr>
+      <w:r>
+        <w:rPr>
+          <w:i/>
+          <w:iCs/>
+          <w:color w:val="555555"/>
+          <w:sz w:val="20"/>
+          <w:szCs w:val="20"/>
+        </w:rPr>
+        <w:t>Figure 3: Entity‑Relationship Diagram (showing all 9 entities, their attributes and their relationships).</w:t>
+      </w:r>
+    </w:p>
+    <w:p>
+      <w:pPr>
+        <w:spacing w:after="100"/>
+      </w:pPr>
+    </w:p>
+    <w:p>
+      <w:pPr>
+        <w:pStyle w:val="Heading2"/>
+        <w:pBdr>
+          <w:bottom w:val="single" w:sz="10" w:space="0" w:color="2E4DA0"/>
+        </w:pBdr>
+      </w:pPr>
+    </w:p>
+    <w:p>
+      <w:pPr>
+        <w:pStyle w:val="Heading2"/>
+        <w:pBdr>
+          <w:bottom w:val="single" w:sz="10" w:space="0" w:color="2E4DA0"/>
+        </w:pBdr>
+      </w:pPr>
+    </w:p>
+    <w:p>
+      <w:pPr>
+        <w:pStyle w:val="Heading2"/>
+        <w:pBdr>
+          <w:bottom w:val="single" w:sz="10" w:space="0" w:color="2E4DA0"/>
+        </w:pBdr>
+      </w:pPr>
+    </w:p>
+    <w:p>
+      <w:pPr>
+        <w:pStyle w:val="Heading2"/>
+        <w:pBdr>
+          <w:bottom w:val="single" w:sz="10" w:space="0" w:color="2E4DA0"/>
+        </w:pBdr>
+      </w:pPr>
+    </w:p>
+    <w:p>
+      <w:pPr>
+        <w:pStyle w:val="Heading2"/>
+        <w:pBdr>
+          <w:bottom w:val="single" w:sz="10" w:space="0" w:color="2E4DA0"/>
+        </w:pBdr>
+      </w:pPr>
+    </w:p>
+    <w:p>
+      <w:pPr>
+        <w:pStyle w:val="Heading2"/>
+      </w:pPr>
+      <w:bookmarkStart w:id="57" w:name="_Toc229261695"/>
+      <w:r>
+        <w:lastRenderedPageBreak/>
+        <w:t>2.5 Relational Schema (Table Definitions)</w:t>
+      </w:r>
+      <w:bookmarkEnd w:id="57"/>
+    </w:p>
+    <w:p>
+      <w:pPr>
+        <w:spacing w:after="120" w:line="288" w:lineRule="auto"/>
+        <w:jc w:val="center"/>
+      </w:pPr>
+      <w:r>
+        <w:rPr>
+          <w:noProof/>
+        </w:rPr>
+        <w:drawing>
+          <wp:inline distT="0" distB="0" distL="114300" distR="114300" wp14:anchorId="11348EFC" wp14:editId="285E0861">
+            <wp:extent cx="5029200" cy="6418121"/>
+            <wp:effectExtent l="0" t="0" r="0" b="0"/>
+            <wp:docPr id="102" name="Schema_Part1"/>
+            <wp:cNvGraphicFramePr>
+              <a:graphicFrameLocks xmlns:a="http://schemas.openxmlformats.org/drawingml/2006/main" noChangeAspect="1"/>
+            </wp:cNvGraphicFramePr>
+            <a:graphic xmlns:a="http://schemas.openxmlformats.org/drawingml/2006/main">
+              <a:graphicData uri="http://schemas.openxmlformats.org/drawingml/2006/picture">
+                <pic:pic xmlns:pic="http://schemas.openxmlformats.org/drawingml/2006/picture">
+                  <pic:nvPicPr>
+                    <pic:cNvPr id="102" name="Schema_Part1"/>
+                    <pic:cNvPicPr/>
+                  </pic:nvPicPr>
+                  <pic:blipFill>
+                    <a:blip r:embed="rId14"/>
+                    <a:stretch>
+                      <a:fillRect/>
+                    </a:stretch>
+                  </pic:blipFill>
+                  <pic:spPr>
+                    <a:xfrm>
+                      <a:off x="0" y="0"/>
+                      <a:ext cx="5029200" cy="6418121"/>
+                    </a:xfrm>
+                    <a:prstGeom prst="rect">
+                      <a:avLst/>
+                    </a:prstGeom>
+                  </pic:spPr>
+                </pic:pic>
+              </a:graphicData>
+            </a:graphic>
+          </wp:inline>
+        </w:drawing>
+      </w:r>
+    </w:p>
+    <w:p>
+      <w:pPr>
+        <w:spacing w:after="120" w:line="288" w:lineRule="auto"/>
+        <w:jc w:val="center"/>
+      </w:pPr>
+      <w:r>
+        <w:rPr>
+          <w:noProof/>
+        </w:rPr>
+        <w:lastRenderedPageBreak/>
+        <w:drawing>
+          <wp:inline distT="0" distB="0" distL="114300" distR="114300" wp14:anchorId="3A7438DF" wp14:editId="17B68F5E">
+            <wp:extent cx="5029200" cy="6502400"/>
+            <wp:effectExtent l="0" t="0" r="0" b="0"/>
+            <wp:docPr id="103" name="Schema_Part2"/>
+            <wp:cNvGraphicFramePr>
+              <a:graphicFrameLocks xmlns:a="http://schemas.openxmlformats.org/drawingml/2006/main" noChangeAspect="1"/>
+            </wp:cNvGraphicFramePr>
+            <a:graphic xmlns:a="http://schemas.openxmlformats.org/drawingml/2006/main">
+              <a:graphicData uri="http://schemas.openxmlformats.org/drawingml/2006/picture">
+                <pic:pic xmlns:pic="http://schemas.openxmlformats.org/drawingml/2006/picture">
+                  <pic:nvPicPr>
+                    <pic:cNvPr id="103" name="Schema_Part2"/>
+                    <pic:cNvPicPr/>
+                  </pic:nvPicPr>
+                  <pic:blipFill>
+                    <a:blip r:embed="rId15"/>
+                    <a:stretch>
+                      <a:fillRect/>
+                    </a:stretch>
+                  </pic:blipFill>
+                  <pic:spPr>
+                    <a:xfrm>
+                      <a:off x="0" y="0"/>
+                      <a:ext cx="5029200" cy="6502400"/>
+                    </a:xfrm>
+                    <a:prstGeom prst="rect">
+                      <a:avLst/>
+                    </a:prstGeom>
+                  </pic:spPr>
+                </pic:pic>
+              </a:graphicData>
+            </a:graphic>
+          </wp:inline>
+        </w:drawing>
+      </w:r>
+    </w:p>
+    <w:p>
+      <w:pPr>
+        <w:spacing w:after="140" w:line="288" w:lineRule="auto"/>
+        <w:jc w:val="center"/>
+      </w:pPr>
+      <w:r>
+        <w:rPr>
+          <w:i/>
+          <w:iCs/>
+          <w:color w:val="555555"/>
+          <w:sz w:val="20"/>
+          <w:szCs w:val="20"/>
+        </w:rPr>
+        <w:t>Figures 4 &amp; 5: Complete relational schema – primary keys (PK), foreign keys (FK), candidate keys (CK), and all attributes.</w:t>
+      </w:r>
+    </w:p>
+    <w:p>
+      <w:pPr>
+        <w:spacing w:after="100"/>
+      </w:pPr>
+    </w:p>
+    <w:p>
+      <w:pPr>
+        <w:pStyle w:val="Heading1"/>
+        <w:pBdr>
+          <w:bottom w:val="single" w:sz="10" w:space="4" w:color="2E4DA0"/>
+        </w:pBdr>
+      </w:pPr>
+    </w:p>
+    <w:p>
+      <w:pPr>
+        <w:pStyle w:val="Heading1"/>
+        <w:pBdr>
+          <w:bottom w:val="single" w:sz="10" w:space="4" w:color="2E4DA0"/>
+        </w:pBdr>
+      </w:pPr>
+    </w:p>
+    <w:p>
+      <w:pPr>
+        <w:pStyle w:val="Heading1"/>
+        <w:pBdr>
+          <w:bottom w:val="single" w:sz="10" w:space="4" w:color="2E4DA0"/>
+        </w:pBdr>
+      </w:pPr>
+    </w:p>
+    <w:p>
+      <w:pPr>
+        <w:pStyle w:val="Heading1"/>
+        <w:pBdr>
+          <w:bottom w:val="single" w:sz="10" w:space="4" w:color="2E4DA0"/>
+        </w:pBdr>
+      </w:pPr>
+      <w:bookmarkStart w:id="58" w:name="_Toc229261696"/>
+      <w:r>
+        <w:lastRenderedPageBreak/>
+        <w:t xml:space="preserve">3. Related </w:t>
+      </w:r>
+      <w:proofErr w:type="gramStart"/>
+      <w:r>
+        <w:t>Work  (</w:t>
+      </w:r>
+      <w:proofErr w:type="gramEnd"/>
+      <w:r>
+        <w:t>One Relevant Application)</w:t>
+      </w:r>
+      <w:bookmarkEnd w:id="58"/>
+    </w:p>
+    <w:p>
+      <w:pPr>
+        <w:spacing w:after="140" w:line="288" w:lineRule="auto"/>
+        <w:jc w:val="both"/>
+      </w:pPr>
+      <w:proofErr w:type="spellStart"/>
+      <w:r>
+        <w:rPr>
+          <w:b/>
+          <w:bCs/>
+        </w:rPr>
+        <w:t>SpotHero</w:t>
+      </w:r>
+      <w:proofErr w:type="spellEnd"/>
+      <w:r>
+        <w:t xml:space="preserve"> (</w:t>
+      </w:r>
+      <w:hyperlink r:id="rId16" w:history="1">
+        <w:r>
+          <w:rPr>
+            <w:color w:val="0563C1"/>
+            <w:u w:val="single" w:color="0563C1"/>
+          </w:rPr>
+          <w:t>https://spothero.com</w:t>
+        </w:r>
+      </w:hyperlink>
+      <w:r>
+        <w:t>) is a widely used commercial parking reservation platform operating across the United States and Canada. It is the closest existing application to this project.</w:t>
+      </w:r>
+      <w:r>
+        <w:rPr>
+          <w:b/>
+          <w:bCs/>
+        </w:rPr>
+        <w:t xml:space="preserve"> [1]</w:t>
+      </w:r>
+    </w:p>
+    <w:p>
+      <w:pPr>
+        <w:spacing w:after="60"/>
+      </w:pPr>
+    </w:p>
+    <w:p>
+      <w:pPr>
+        <w:pStyle w:val="Heading2"/>
+      </w:pPr>
+      <w:bookmarkStart w:id="59" w:name="_Toc229261697"/>
+      <w:r>
+        <w:t xml:space="preserve">3.1 Study Application: </w:t>
+      </w:r>
+      <w:proofErr w:type="spellStart"/>
+      <w:r>
+        <w:t>SpotHero</w:t>
+      </w:r>
+      <w:bookmarkEnd w:id="59"/>
+      <w:proofErr w:type="spellEnd"/>
+    </w:p>
+    <w:p>
+      <w:pPr>
+        <w:spacing w:after="140" w:line="288" w:lineRule="auto"/>
+        <w:jc w:val="both"/>
+      </w:pPr>
+      <w:proofErr w:type="spellStart"/>
+      <w:r>
+        <w:t>SpotHero</w:t>
+      </w:r>
+      <w:proofErr w:type="spellEnd"/>
+      <w:r>
+        <w:t xml:space="preserve"> allows drivers to search for parking near any location, compare prices across competing lots, and reserve spots in advance via a web or mobile interface. It is used by thousands of parking facilities across North America.</w:t>
+      </w:r>
+      <w:r>
+        <w:rPr>
+          <w:b/>
+          <w:bCs/>
+        </w:rPr>
+        <w:t xml:space="preserve"> [1]</w:t>
+      </w:r>
+    </w:p>
+    <w:p>
+      <w:pPr>
+        <w:spacing w:after="60"/>
+      </w:pPr>
+    </w:p>
+    <w:p>
+      <w:pPr>
+        <w:pStyle w:val="Heading2"/>
+      </w:pPr>
+      <w:bookmarkStart w:id="60" w:name="_Toc229261698"/>
+      <w:r>
+        <w:t>3.2 Features</w:t>
+      </w:r>
+      <w:bookmarkEnd w:id="60"/>
+    </w:p>
+    <w:p>
+      <w:pPr>
+        <w:pStyle w:val="ListParagraph"/>
+        <w:numPr>
+          <w:ilvl w:val="0"/>
+          <w:numId w:val="2"/>
+        </w:numPr>
+        <w:spacing w:after="90"/>
+        <w:jc w:val="both"/>
+      </w:pPr>
+      <w:r>
+        <w:rPr>
+          <w:b/>
+          <w:bCs/>
+        </w:rPr>
+        <w:t xml:space="preserve">Location-based search: </w:t>
+      </w:r>
+      <w:r>
+        <w:t>Find parking near any address or destination.</w:t>
+      </w:r>
+    </w:p>
+    <w:p>
+      <w:pPr>
+        <w:pStyle w:val="ListParagraph"/>
+        <w:numPr>
+          <w:ilvl w:val="0"/>
+          <w:numId w:val="2"/>
+        </w:numPr>
+        <w:spacing w:after="90"/>
+        <w:jc w:val="both"/>
+      </w:pPr>
+      <w:r>
+        <w:rPr>
+          <w:b/>
+          <w:bCs/>
+        </w:rPr>
+        <w:t xml:space="preserve">Advance booking: </w:t>
+      </w:r>
+      <w:r>
+        <w:t>Reserve spots ahead of time with instant confirmation.</w:t>
+      </w:r>
+    </w:p>
+    <w:p>
+      <w:pPr>
+        <w:pStyle w:val="ListParagraph"/>
+        <w:numPr>
+          <w:ilvl w:val="0"/>
+          <w:numId w:val="2"/>
+        </w:numPr>
+        <w:spacing w:after="90"/>
+        <w:jc w:val="both"/>
+      </w:pPr>
+      <w:r>
+        <w:rPr>
+          <w:b/>
+          <w:bCs/>
+        </w:rPr>
+        <w:t xml:space="preserve">Mobile app: </w:t>
+      </w:r>
+      <w:r>
+        <w:t>QR-code-based entry to partner garages via iOS and Android apps.</w:t>
+      </w:r>
+    </w:p>
+    <w:p>
+      <w:pPr>
+        <w:pStyle w:val="ListParagraph"/>
+        <w:numPr>
+          <w:ilvl w:val="0"/>
+          <w:numId w:val="2"/>
+        </w:numPr>
+        <w:spacing w:after="90"/>
+        <w:jc w:val="both"/>
+      </w:pPr>
+      <w:r>
+        <w:rPr>
+          <w:b/>
+          <w:bCs/>
+        </w:rPr>
+        <w:t xml:space="preserve">Price comparison: </w:t>
+      </w:r>
+      <w:r>
+        <w:t>Compare rates across multiple lots in the same area.</w:t>
+      </w:r>
+    </w:p>
+    <w:p>
+      <w:pPr>
+        <w:pStyle w:val="ListParagraph"/>
+        <w:numPr>
+          <w:ilvl w:val="0"/>
+          <w:numId w:val="2"/>
+        </w:numPr>
+        <w:spacing w:after="90"/>
+        <w:jc w:val="both"/>
+      </w:pPr>
+      <w:r>
+        <w:rPr>
+          <w:b/>
+          <w:bCs/>
+        </w:rPr>
+        <w:t xml:space="preserve">Customer reviews: </w:t>
+      </w:r>
+      <w:r>
+        <w:t>Users can rate and review individual parking facilities.</w:t>
+      </w:r>
+    </w:p>
+    <w:p>
+      <w:pPr>
+        <w:pStyle w:val="ListParagraph"/>
+        <w:numPr>
+          <w:ilvl w:val="0"/>
+          <w:numId w:val="2"/>
+        </w:numPr>
+        <w:spacing w:after="90"/>
+        <w:jc w:val="both"/>
+      </w:pPr>
+      <w:r>
+        <w:rPr>
+          <w:b/>
+          <w:bCs/>
+        </w:rPr>
+        <w:t xml:space="preserve">Monthly subscriptions: </w:t>
+      </w:r>
+      <w:r>
+        <w:t>Support for recurring monthly commuter parking at discounted rates.</w:t>
+      </w:r>
+    </w:p>
+    <w:p>
+      <w:pPr>
+        <w:spacing w:after="60"/>
+      </w:pPr>
+    </w:p>
+    <w:p>
+      <w:pPr>
+        <w:pStyle w:val="Heading2"/>
+      </w:pPr>
+      <w:bookmarkStart w:id="61" w:name="_Toc229261699"/>
+      <w:r>
+        <w:t>3.3 Shortcomings</w:t>
+      </w:r>
+      <w:bookmarkEnd w:id="61"/>
+    </w:p>
+    <w:p>
+      <w:pPr>
+        <w:pStyle w:val="ListParagraph"/>
+        <w:numPr>
+          <w:ilvl w:val="0"/>
+          <w:numId w:val="2"/>
+        </w:numPr>
+        <w:spacing w:after="90"/>
+        <w:jc w:val="both"/>
+      </w:pPr>
+      <w:r>
+        <w:rPr>
+          <w:b/>
+          <w:bCs/>
+        </w:rPr>
+        <w:t xml:space="preserve">No dynamic pricing: </w:t>
+      </w:r>
+      <w:r>
+        <w:t>Prices are set manually by operators — no real-time demand adjustment based on occupancy.</w:t>
+      </w:r>
+    </w:p>
+    <w:p>
+      <w:pPr>
+        <w:pStyle w:val="ListParagraph"/>
+        <w:numPr>
+          <w:ilvl w:val="0"/>
+          <w:numId w:val="2"/>
+        </w:numPr>
+        <w:spacing w:after="90"/>
+        <w:jc w:val="both"/>
+      </w:pPr>
+      <w:r>
+        <w:rPr>
+          <w:b/>
+          <w:bCs/>
+        </w:rPr>
+        <w:t xml:space="preserve">No digital wallet: </w:t>
+      </w:r>
+      <w:r>
+        <w:t>All payments go through external cards only — no in-app pre-loaded balance.</w:t>
+      </w:r>
+    </w:p>
+    <w:p>
+      <w:pPr>
+        <w:pStyle w:val="ListParagraph"/>
+        <w:numPr>
+          <w:ilvl w:val="0"/>
+          <w:numId w:val="2"/>
+        </w:numPr>
+        <w:spacing w:after="90"/>
+        <w:jc w:val="both"/>
+      </w:pPr>
+      <w:r>
+        <w:rPr>
+          <w:b/>
+          <w:bCs/>
+        </w:rPr>
+        <w:t xml:space="preserve">No loyalty programme: </w:t>
+      </w:r>
+      <w:r>
+        <w:t>No points, rewards, or repeat-user incentives of any kind.</w:t>
+      </w:r>
+    </w:p>
+    <w:p>
+      <w:pPr>
+        <w:pStyle w:val="ListParagraph"/>
+        <w:numPr>
+          <w:ilvl w:val="0"/>
+          <w:numId w:val="2"/>
+        </w:numPr>
+        <w:spacing w:after="90"/>
+        <w:jc w:val="both"/>
+      </w:pPr>
+      <w:proofErr w:type="gramStart"/>
+      <w:r>
+        <w:rPr>
+          <w:b/>
+          <w:bCs/>
+        </w:rPr>
+        <w:t>Manual</w:t>
+      </w:r>
+      <w:proofErr w:type="gramEnd"/>
+      <w:r>
+        <w:rPr>
+          <w:b/>
+          <w:bCs/>
+        </w:rPr>
+        <w:t xml:space="preserve"> overstay enforcement: </w:t>
+      </w:r>
+      <w:r>
+        <w:t>No automated detection or fining — entirely handled by physical lot staff.</w:t>
+      </w:r>
+    </w:p>
+    <w:p>
+      <w:pPr>
+        <w:pStyle w:val="ListParagraph"/>
+        <w:numPr>
+          <w:ilvl w:val="0"/>
+          <w:numId w:val="2"/>
+        </w:numPr>
+        <w:spacing w:after="90"/>
+        <w:jc w:val="both"/>
+      </w:pPr>
+      <w:r>
+        <w:rPr>
+          <w:b/>
+          <w:bCs/>
+        </w:rPr>
+        <w:t xml:space="preserve">No referral system: </w:t>
+      </w:r>
+      <w:r>
+        <w:t>No mechanism to reward users for bringing in new users.</w:t>
+      </w:r>
+    </w:p>
+    <w:p>
+      <w:pPr>
+        <w:pStyle w:val="ListParagraph"/>
+        <w:numPr>
+          <w:ilvl w:val="0"/>
+          <w:numId w:val="2"/>
+        </w:numPr>
+        <w:spacing w:after="90"/>
+        <w:jc w:val="both"/>
+      </w:pPr>
+      <w:r>
+        <w:rPr>
+          <w:b/>
+          <w:bCs/>
+        </w:rPr>
+        <w:t xml:space="preserve">Limited reporting: </w:t>
+      </w:r>
+      <w:r>
+        <w:t>Basic transaction summaries only — no structured revenue or analytics reports.</w:t>
+      </w:r>
+    </w:p>
+    <w:p>
+      <w:pPr>
+        <w:spacing w:after="90"/>
+        <w:jc w:val="both"/>
+      </w:pPr>
+    </w:p>
+    <w:p>
+      <w:pPr>
+        <w:spacing w:after="90"/>
+        <w:jc w:val="both"/>
+      </w:pPr>
+    </w:p>
+    <w:p>
+      <w:pPr>
+        <w:spacing w:after="90"/>
+        <w:jc w:val="both"/>
+      </w:pPr>
+    </w:p>
+    <w:p>
+      <w:pPr>
+        <w:spacing w:after="80"/>
+      </w:pPr>
+    </w:p>
+    <w:p>
+      <w:pPr>
+        <w:spacing w:after="80"/>
       </w:pPr>
     </w:p>
     <w:tbl>
@@ -2586,6 +5445,220 @@
         <w:gridCol w:w="2680"/>
       </w:tblGrid>
       <w:tr>
+        <w:trPr>
+          <w:tblHeader/>
+        </w:trPr>
+        <w:tc>
+          <w:tcPr>
+            <w:tcW w:w="4000" w:type="dxa"/>
+            <w:tcBorders>
+              <w:top w:val="single" w:sz="4" w:space="0" w:color="1A5276"/>
+              <w:left w:val="single" w:sz="4" w:space="0" w:color="1A5276"/>
+              <w:bottom w:val="single" w:sz="4" w:space="0" w:color="1A5276"/>
+              <w:right w:val="single" w:sz="4" w:space="0" w:color="1A5276"/>
+            </w:tcBorders>
+            <w:shd w:val="clear" w:color="auto" w:fill="1A5276"/>
+            <w:tcMar>
+              <w:top w:w="100" w:type="dxa"/>
+              <w:left w:w="140" w:type="dxa"/>
+              <w:bottom w:w="100" w:type="dxa"/>
+              <w:right w:w="140" w:type="dxa"/>
+            </w:tcMar>
+            <w:vAlign w:val="center"/>
+          </w:tcPr>
+          <w:p>
+            <w:pPr>
+              <w:jc w:val="center"/>
+            </w:pPr>
+            <w:r>
+              <w:rPr>
+                <w:rFonts w:ascii="Arial" w:eastAsia="Arial" w:hAnsi="Arial" w:cs="Arial"/>
+                <w:b/>
+                <w:bCs/>
+                <w:color w:val="FFFFFF"/>
+                <w:sz w:val="20"/>
+                <w:szCs w:val="20"/>
+              </w:rPr>
+              <w:lastRenderedPageBreak/>
+              <w:t>Features</w:t>
+            </w:r>
+          </w:p>
+        </w:tc>
+        <w:tc>
+          <w:tcPr>
+            <w:tcW w:w="2680" w:type="dxa"/>
+            <w:tcBorders>
+              <w:top w:val="single" w:sz="4" w:space="0" w:color="1A5276"/>
+              <w:left w:val="single" w:sz="4" w:space="0" w:color="1A5276"/>
+              <w:bottom w:val="single" w:sz="4" w:space="0" w:color="1A5276"/>
+              <w:right w:val="single" w:sz="4" w:space="0" w:color="1A5276"/>
+            </w:tcBorders>
+            <w:shd w:val="clear" w:color="auto" w:fill="1A5276"/>
+            <w:tcMar>
+              <w:top w:w="100" w:type="dxa"/>
+              <w:left w:w="140" w:type="dxa"/>
+              <w:bottom w:w="100" w:type="dxa"/>
+              <w:right w:w="140" w:type="dxa"/>
+            </w:tcMar>
+            <w:vAlign w:val="center"/>
+          </w:tcPr>
+          <w:p>
+            <w:pPr>
+              <w:jc w:val="center"/>
+            </w:pPr>
+            <w:proofErr w:type="spellStart"/>
+            <w:r>
+              <w:rPr>
+                <w:rFonts w:ascii="Arial" w:eastAsia="Arial" w:hAnsi="Arial" w:cs="Arial"/>
+                <w:b/>
+                <w:bCs/>
+                <w:color w:val="FFFFFF"/>
+                <w:sz w:val="20"/>
+                <w:szCs w:val="20"/>
+              </w:rPr>
+              <w:t>SpotHero</w:t>
+            </w:r>
+            <w:proofErr w:type="spellEnd"/>
+          </w:p>
+        </w:tc>
+        <w:tc>
+          <w:tcPr>
+            <w:tcW w:w="2680" w:type="dxa"/>
+            <w:tcBorders>
+              <w:top w:val="single" w:sz="4" w:space="0" w:color="1A5276"/>
+              <w:left w:val="single" w:sz="4" w:space="0" w:color="1A5276"/>
+              <w:bottom w:val="single" w:sz="4" w:space="0" w:color="1A5276"/>
+              <w:right w:val="single" w:sz="4" w:space="0" w:color="1A5276"/>
+            </w:tcBorders>
+            <w:shd w:val="clear" w:color="auto" w:fill="1A5276"/>
+            <w:tcMar>
+              <w:top w:w="100" w:type="dxa"/>
+              <w:left w:w="140" w:type="dxa"/>
+              <w:bottom w:w="100" w:type="dxa"/>
+              <w:right w:w="140" w:type="dxa"/>
+            </w:tcMar>
+            <w:vAlign w:val="center"/>
+          </w:tcPr>
+          <w:p>
+            <w:pPr>
+              <w:jc w:val="center"/>
+            </w:pPr>
+            <w:r>
+              <w:rPr>
+                <w:rFonts w:ascii="Arial" w:eastAsia="Arial" w:hAnsi="Arial" w:cs="Arial"/>
+                <w:b/>
+                <w:bCs/>
+                <w:color w:val="FFFFFF"/>
+                <w:sz w:val="20"/>
+                <w:szCs w:val="20"/>
+              </w:rPr>
+              <w:t>Smart Parking System</w:t>
+            </w:r>
+          </w:p>
+        </w:tc>
+      </w:tr>
+      <w:tr>
+        <w:tc>
+          <w:tcPr>
+            <w:tcW w:w="4000" w:type="dxa"/>
+            <w:tcBorders>
+              <w:top w:val="single" w:sz="4" w:space="0" w:color="CCCCCC"/>
+              <w:left w:val="single" w:sz="4" w:space="0" w:color="CCCCCC"/>
+              <w:bottom w:val="single" w:sz="4" w:space="0" w:color="CCCCCC"/>
+              <w:right w:val="single" w:sz="4" w:space="0" w:color="CCCCCC"/>
+            </w:tcBorders>
+            <w:shd w:val="clear" w:color="auto" w:fill="FFFFFF"/>
+            <w:tcMar>
+              <w:top w:w="80" w:type="dxa"/>
+              <w:left w:w="140" w:type="dxa"/>
+              <w:bottom w:w="80" w:type="dxa"/>
+              <w:right w:w="140" w:type="dxa"/>
+            </w:tcMar>
+          </w:tcPr>
+          <w:p>
+            <w:r>
+              <w:rPr>
+                <w:sz w:val="20"/>
+                <w:szCs w:val="20"/>
+              </w:rPr>
+              <w:t>Advance spot reservation</w:t>
+            </w:r>
+          </w:p>
+        </w:tc>
+        <w:tc>
+          <w:tcPr>
+            <w:tcW w:w="2680" w:type="dxa"/>
+            <w:tcBorders>
+              <w:top w:val="single" w:sz="4" w:space="0" w:color="CCCCCC"/>
+              <w:left w:val="single" w:sz="4" w:space="0" w:color="CCCCCC"/>
+              <w:bottom w:val="single" w:sz="4" w:space="0" w:color="CCCCCC"/>
+              <w:right w:val="single" w:sz="4" w:space="0" w:color="CCCCCC"/>
+            </w:tcBorders>
+            <w:shd w:val="clear" w:color="auto" w:fill="FFFFFF"/>
+            <w:tcMar>
+              <w:top w:w="80" w:type="dxa"/>
+              <w:left w:w="80" w:type="dxa"/>
+              <w:bottom w:w="80" w:type="dxa"/>
+              <w:right w:w="80" w:type="dxa"/>
+            </w:tcMar>
+            <w:vAlign w:val="center"/>
+          </w:tcPr>
+          <w:p>
+            <w:pPr>
+              <w:jc w:val="center"/>
+            </w:pPr>
+            <w:proofErr w:type="gramStart"/>
+            <w:r>
+              <w:rPr>
+                <w:b/>
+                <w:bCs/>
+                <w:color w:val="145A32"/>
+                <w:sz w:val="20"/>
+                <w:szCs w:val="20"/>
+              </w:rPr>
+              <w:t>✓  Yes</w:t>
+            </w:r>
+            <w:proofErr w:type="gramEnd"/>
+          </w:p>
+        </w:tc>
+        <w:tc>
+          <w:tcPr>
+            <w:tcW w:w="2680" w:type="dxa"/>
+            <w:tcBorders>
+              <w:top w:val="single" w:sz="4" w:space="0" w:color="CCCCCC"/>
+              <w:left w:val="single" w:sz="4" w:space="0" w:color="CCCCCC"/>
+              <w:bottom w:val="single" w:sz="4" w:space="0" w:color="CCCCCC"/>
+              <w:right w:val="single" w:sz="4" w:space="0" w:color="CCCCCC"/>
+            </w:tcBorders>
+            <w:shd w:val="clear" w:color="auto" w:fill="FFFFFF"/>
+            <w:tcMar>
+              <w:top w:w="80" w:type="dxa"/>
+              <w:left w:w="80" w:type="dxa"/>
+              <w:bottom w:w="80" w:type="dxa"/>
+              <w:right w:w="80" w:type="dxa"/>
+            </w:tcMar>
+            <w:vAlign w:val="center"/>
+          </w:tcPr>
+          <w:p>
+            <w:pPr>
+              <w:jc w:val="center"/>
+            </w:pPr>
+            <w:proofErr w:type="gramStart"/>
+            <w:r>
+              <w:rPr>
+                <w:b/>
+                <w:bCs/>
+                <w:color w:val="145A32"/>
+                <w:sz w:val="20"/>
+                <w:szCs w:val="20"/>
+              </w:rPr>
+              <w:t>✓  Yes</w:t>
+            </w:r>
+            <w:proofErr w:type="gramEnd"/>
+          </w:p>
+        </w:tc>
+      </w:tr>
+      <w:tr>
         <w:tc>
           <w:tcPr>
             <w:tcW w:w="4000" w:type="dxa"/>
@@ -2609,7 +5682,6 @@
                 <w:sz w:val="20"/>
                 <w:szCs w:val="20"/>
               </w:rPr>
-              <w:lastRenderedPageBreak/>
               <w:t>Real-time availability tracking</w:t>
             </w:r>
           </w:p>
@@ -2636,6 +5708,7 @@
             <w:pPr>
               <w:jc w:val="center"/>
             </w:pPr>
+            <w:proofErr w:type="gramStart"/>
             <w:r>
               <w:rPr>
                 <w:b/>
@@ -2646,6 +5719,7 @@
               </w:rPr>
               <w:t>✗  No</w:t>
             </w:r>
+            <w:proofErr w:type="gramEnd"/>
           </w:p>
         </w:tc>
         <w:tc>
@@ -2670,6 +5744,7 @@
             <w:pPr>
               <w:jc w:val="center"/>
             </w:pPr>
+            <w:proofErr w:type="gramStart"/>
             <w:r>
               <w:rPr>
                 <w:b/>
@@ -2680,6 +5755,7 @@
               </w:rPr>
               <w:t>✓  Yes</w:t>
             </w:r>
+            <w:proofErr w:type="gramEnd"/>
           </w:p>
         </w:tc>
       </w:tr>
@@ -2733,6 +5809,7 @@
             <w:pPr>
               <w:jc w:val="center"/>
             </w:pPr>
+            <w:proofErr w:type="gramStart"/>
             <w:r>
               <w:rPr>
                 <w:b/>
@@ -2743,6 +5820,7 @@
               </w:rPr>
               <w:t>✗  No</w:t>
             </w:r>
+            <w:proofErr w:type="gramEnd"/>
           </w:p>
         </w:tc>
         <w:tc>
@@ -2767,6 +5845,7 @@
             <w:pPr>
               <w:jc w:val="center"/>
             </w:pPr>
+            <w:proofErr w:type="gramStart"/>
             <w:r>
               <w:rPr>
                 <w:b/>
@@ -2777,6 +5856,7 @@
               </w:rPr>
               <w:t>✓  Yes</w:t>
             </w:r>
+            <w:proofErr w:type="gramEnd"/>
           </w:p>
         </w:tc>
       </w:tr>
@@ -2830,6 +5910,7 @@
             <w:pPr>
               <w:jc w:val="center"/>
             </w:pPr>
+            <w:proofErr w:type="gramStart"/>
             <w:r>
               <w:rPr>
                 <w:b/>
@@ -2840,6 +5921,7 @@
               </w:rPr>
               <w:t>✗  No</w:t>
             </w:r>
+            <w:proofErr w:type="gramEnd"/>
           </w:p>
         </w:tc>
         <w:tc>
@@ -2864,6 +5946,7 @@
             <w:pPr>
               <w:jc w:val="center"/>
             </w:pPr>
+            <w:proofErr w:type="gramStart"/>
             <w:r>
               <w:rPr>
                 <w:b/>
@@ -2874,6 +5957,7 @@
               </w:rPr>
               <w:t>✓  Yes</w:t>
             </w:r>
+            <w:proofErr w:type="gramEnd"/>
           </w:p>
         </w:tc>
       </w:tr>
@@ -2927,6 +6011,7 @@
             <w:pPr>
               <w:jc w:val="center"/>
             </w:pPr>
+            <w:proofErr w:type="gramStart"/>
             <w:r>
               <w:rPr>
                 <w:b/>
@@ -2937,6 +6022,7 @@
               </w:rPr>
               <w:t>✗  No</w:t>
             </w:r>
+            <w:proofErr w:type="gramEnd"/>
           </w:p>
         </w:tc>
         <w:tc>
@@ -2961,6 +6047,7 @@
             <w:pPr>
               <w:jc w:val="center"/>
             </w:pPr>
+            <w:proofErr w:type="gramStart"/>
             <w:r>
               <w:rPr>
                 <w:b/>
@@ -2971,6 +6058,7 @@
               </w:rPr>
               <w:t>✓  Yes</w:t>
             </w:r>
+            <w:proofErr w:type="gramEnd"/>
           </w:p>
         </w:tc>
       </w:tr>
@@ -3024,6 +6112,7 @@
             <w:pPr>
               <w:jc w:val="center"/>
             </w:pPr>
+            <w:proofErr w:type="gramStart"/>
             <w:r>
               <w:rPr>
                 <w:b/>
@@ -3034,6 +6123,7 @@
               </w:rPr>
               <w:t>✗  No</w:t>
             </w:r>
+            <w:proofErr w:type="gramEnd"/>
           </w:p>
         </w:tc>
         <w:tc>
@@ -3058,6 +6148,7 @@
             <w:pPr>
               <w:jc w:val="center"/>
             </w:pPr>
+            <w:proofErr w:type="gramStart"/>
             <w:r>
               <w:rPr>
                 <w:b/>
@@ -3068,6 +6159,7 @@
               </w:rPr>
               <w:t>✓  Yes</w:t>
             </w:r>
+            <w:proofErr w:type="gramEnd"/>
           </w:p>
         </w:tc>
       </w:tr>
@@ -3121,6 +6213,7 @@
             <w:pPr>
               <w:jc w:val="center"/>
             </w:pPr>
+            <w:proofErr w:type="gramStart"/>
             <w:r>
               <w:rPr>
                 <w:b/>
@@ -3131,6 +6224,7 @@
               </w:rPr>
               <w:t>✗  No</w:t>
             </w:r>
+            <w:proofErr w:type="gramEnd"/>
           </w:p>
         </w:tc>
         <w:tc>
@@ -3155,6 +6249,7 @@
             <w:pPr>
               <w:jc w:val="center"/>
             </w:pPr>
+            <w:proofErr w:type="gramStart"/>
             <w:r>
               <w:rPr>
                 <w:b/>
@@ -3165,6 +6260,7 @@
               </w:rPr>
               <w:t>✓  Yes</w:t>
             </w:r>
+            <w:proofErr w:type="gramEnd"/>
           </w:p>
         </w:tc>
       </w:tr>
@@ -3218,6 +6314,7 @@
             <w:pPr>
               <w:jc w:val="center"/>
             </w:pPr>
+            <w:proofErr w:type="gramStart"/>
             <w:r>
               <w:rPr>
                 <w:b/>
@@ -3228,6 +6325,7 @@
               </w:rPr>
               <w:t>✗  No</w:t>
             </w:r>
+            <w:proofErr w:type="gramEnd"/>
           </w:p>
         </w:tc>
         <w:tc>
@@ -3252,6 +6350,7 @@
             <w:pPr>
               <w:jc w:val="center"/>
             </w:pPr>
+            <w:proofErr w:type="gramStart"/>
             <w:r>
               <w:rPr>
                 <w:b/>
@@ -3262,6 +6361,7 @@
               </w:rPr>
               <w:t>✓  Yes</w:t>
             </w:r>
+            <w:proofErr w:type="gramEnd"/>
           </w:p>
         </w:tc>
       </w:tr>
@@ -3315,6 +6415,7 @@
             <w:pPr>
               <w:jc w:val="center"/>
             </w:pPr>
+            <w:proofErr w:type="gramStart"/>
             <w:r>
               <w:rPr>
                 <w:b/>
@@ -3325,6 +6426,7 @@
               </w:rPr>
               <w:t>✓  Yes</w:t>
             </w:r>
+            <w:proofErr w:type="gramEnd"/>
           </w:p>
         </w:tc>
         <w:tc>
@@ -3349,6 +6451,7 @@
             <w:pPr>
               <w:jc w:val="center"/>
             </w:pPr>
+            <w:proofErr w:type="gramStart"/>
             <w:r>
               <w:rPr>
                 <w:b/>
@@ -3359,6 +6462,7 @@
               </w:rPr>
               <w:t>✗  No</w:t>
             </w:r>
+            <w:proofErr w:type="gramEnd"/>
           </w:p>
         </w:tc>
       </w:tr>
@@ -3412,6 +6516,7 @@
             <w:pPr>
               <w:jc w:val="center"/>
             </w:pPr>
+            <w:proofErr w:type="gramStart"/>
             <w:r>
               <w:rPr>
                 <w:b/>
@@ -3422,6 +6527,7 @@
               </w:rPr>
               <w:t>✓  Yes</w:t>
             </w:r>
+            <w:proofErr w:type="gramEnd"/>
           </w:p>
         </w:tc>
         <w:tc>
@@ -3446,6 +6552,7 @@
             <w:pPr>
               <w:jc w:val="center"/>
             </w:pPr>
+            <w:proofErr w:type="gramStart"/>
             <w:r>
               <w:rPr>
                 <w:b/>
@@ -3456,6 +6563,7 @@
               </w:rPr>
               <w:t>✗  No</w:t>
             </w:r>
+            <w:proofErr w:type="gramEnd"/>
           </w:p>
         </w:tc>
       </w:tr>
@@ -3477,7 +6585,29 @@
           <w:sz w:val="20"/>
           <w:szCs w:val="20"/>
         </w:rPr>
-        <w:t>Table 3: Feature comparison between SpotHero [1] and the proposed Smart Parking System.</w:t>
+        <w:t xml:space="preserve">Table 3: Feature comparison between </w:t>
+      </w:r>
+      <w:proofErr w:type="spellStart"/>
+      <w:r>
+        <w:rPr>
+          <w:i/>
+          <w:iCs/>
+          <w:color w:val="555555"/>
+          <w:sz w:val="20"/>
+          <w:szCs w:val="20"/>
+        </w:rPr>
+        <w:t>SpotHero</w:t>
+      </w:r>
+      <w:proofErr w:type="spellEnd"/>
+      <w:r>
+        <w:rPr>
+          <w:i/>
+          <w:iCs/>
+          <w:color w:val="555555"/>
+          <w:sz w:val="20"/>
+          <w:szCs w:val="20"/>
+        </w:rPr>
+        <w:t xml:space="preserve"> [1] and the proposed Smart Parking System.</w:t>
       </w:r>
     </w:p>
     <w:p>
@@ -3487,11 +6617,11 @@
           <w:bottom w:val="single" w:sz="10" w:space="4" w:color="2E4DA0"/>
         </w:pBdr>
       </w:pPr>
-      <w:bookmarkStart w:id="51" w:name="_Toc229261700"/>
+      <w:bookmarkStart w:id="62" w:name="_Toc229261700"/>
       <w:r>
         <w:t>4. Tools</w:t>
       </w:r>
-      <w:bookmarkEnd w:id="51"/>
+      <w:bookmarkEnd w:id="62"/>
     </w:p>
     <w:p>
       <w:pPr>
@@ -3836,6 +6966,7 @@
                 <w:szCs w:val="20"/>
               </w:rPr>
             </w:pPr>
+            <w:proofErr w:type="spellStart"/>
             <w:r>
               <w:rPr>
                 <w:rFonts w:ascii="Courier New" w:eastAsia="Courier New" w:hAnsi="Courier New" w:cs="Courier New"/>
@@ -3845,6 +6976,7 @@
               </w:rPr>
               <w:t>pyodbc</w:t>
             </w:r>
+            <w:proofErr w:type="spellEnd"/>
           </w:p>
         </w:tc>
       </w:tr>
@@ -4076,6 +7208,7 @@
                 <w:szCs w:val="20"/>
               </w:rPr>
             </w:pPr>
+            <w:proofErr w:type="spellStart"/>
             <w:r>
               <w:rPr>
                 <w:rFonts w:ascii="Courier New" w:eastAsia="Courier New" w:hAnsi="Courier New" w:cs="Courier New"/>
@@ -4085,6 +7218,7 @@
               </w:rPr>
               <w:t>hashlib</w:t>
             </w:r>
+            <w:proofErr w:type="spellEnd"/>
           </w:p>
         </w:tc>
       </w:tr>
@@ -4188,11 +7322,11 @@
           <w:bottom w:val="single" w:sz="10" w:space="4" w:color="2E4DA0"/>
         </w:pBdr>
       </w:pPr>
-      <w:bookmarkStart w:id="52" w:name="_Toc229261701"/>
+      <w:bookmarkStart w:id="63" w:name="_Toc229261701"/>
       <w:r>
         <w:t>5. References</w:t>
       </w:r>
-      <w:bookmarkEnd w:id="52"/>
+      <w:bookmarkEnd w:id="63"/>
     </w:p>
     <w:p>
       <w:pPr>
@@ -4286,7 +7420,7 @@
             <w:r>
               <w:t xml:space="preserve"> Date: May 2, 2026, from </w:t>
             </w:r>
-            <w:hyperlink r:id="rId11" w:history="1">
+            <w:hyperlink r:id="rId17" w:history="1">
               <w:r>
                 <w:rPr>
                   <w:color w:val="0563C1"/>
@@ -4358,7 +7492,55 @@
                 <w:sz w:val="16"/>
                 <w:szCs w:val="16"/>
               </w:rPr>
-              <w:t>Department of Computer Science  —  COMSATS University Islamabad, Lahore Campus  —  Spring 2026</w:t>
+              <w:t xml:space="preserve">Department of Computer </w:t>
+            </w:r>
+            <w:proofErr w:type="gramStart"/>
+            <w:r>
+              <w:rPr>
+                <w:rFonts w:ascii="Arial" w:eastAsia="Arial" w:hAnsi="Arial" w:cs="Arial"/>
+                <w:i/>
+                <w:iCs/>
+                <w:color w:val="AABCD0"/>
+                <w:sz w:val="16"/>
+                <w:szCs w:val="16"/>
+              </w:rPr>
+              <w:t>Science  —</w:t>
+            </w:r>
+            <w:proofErr w:type="gramEnd"/>
+            <w:r>
+              <w:rPr>
+                <w:rFonts w:ascii="Arial" w:eastAsia="Arial" w:hAnsi="Arial" w:cs="Arial"/>
+                <w:i/>
+                <w:iCs/>
+                <w:color w:val="AABCD0"/>
+                <w:sz w:val="16"/>
+                <w:szCs w:val="16"/>
+              </w:rPr>
+              <w:t xml:space="preserve">  COMSATS University Islamabad, Lahore </w:t>
+            </w:r>
+            <w:proofErr w:type="gramStart"/>
+            <w:r>
+              <w:rPr>
+                <w:rFonts w:ascii="Arial" w:eastAsia="Arial" w:hAnsi="Arial" w:cs="Arial"/>
+                <w:i/>
+                <w:iCs/>
+                <w:color w:val="AABCD0"/>
+                <w:sz w:val="16"/>
+                <w:szCs w:val="16"/>
+              </w:rPr>
+              <w:t>Campus  —</w:t>
+            </w:r>
+            <w:proofErr w:type="gramEnd"/>
+            <w:r>
+              <w:rPr>
+                <w:rFonts w:ascii="Arial" w:eastAsia="Arial" w:hAnsi="Arial" w:cs="Arial"/>
+                <w:i/>
+                <w:iCs/>
+                <w:color w:val="AABCD0"/>
+                <w:sz w:val="16"/>
+                <w:szCs w:val="16"/>
+              </w:rPr>
+              <w:t xml:space="preserve">  Spring 2026</w:t>
             </w:r>
           </w:p>
         </w:tc>
@@ -4366,7 +7548,7 @@
     </w:tbl>
     <w:p/>
     <w:sectPr>
-      <w:footerReference w:type="default" r:id="rId12"/>
+      <w:footerReference w:type="default" r:id="rId18"/>
       <w:pgSz w:w="11906" w:h="16838"/>
       <w:pgMar w:top="1440" w:right="1260" w:bottom="1440" w:left="1620" w:header="708" w:footer="708" w:gutter="0"/>
       <w:pgBorders w:offsetFrom="page">
@@ -4419,7 +7601,47 @@
         <w:sz w:val="16"/>
         <w:szCs w:val="16"/>
       </w:rPr>
-      <w:t>Computer Science Dept.  |  4th Semester  |  Spring 2026</w:t>
+      <w:t xml:space="preserve">Computer Science Dept.  </w:t>
+    </w:r>
+    <w:proofErr w:type="gramStart"/>
+    <w:r>
+      <w:rPr>
+        <w:rFonts w:ascii="Arial" w:eastAsia="Arial" w:hAnsi="Arial" w:cs="Arial"/>
+        <w:color w:val="888888"/>
+        <w:sz w:val="16"/>
+        <w:szCs w:val="16"/>
+      </w:rPr>
+      <w:t>|  4</w:t>
+    </w:r>
+    <w:proofErr w:type="gramEnd"/>
+    <w:r>
+      <w:rPr>
+        <w:rFonts w:ascii="Arial" w:eastAsia="Arial" w:hAnsi="Arial" w:cs="Arial"/>
+        <w:color w:val="888888"/>
+        <w:sz w:val="16"/>
+        <w:szCs w:val="16"/>
+      </w:rPr>
+      <w:t xml:space="preserve">th </w:t>
+    </w:r>
+    <w:proofErr w:type="gramStart"/>
+    <w:r>
+      <w:rPr>
+        <w:rFonts w:ascii="Arial" w:eastAsia="Arial" w:hAnsi="Arial" w:cs="Arial"/>
+        <w:color w:val="888888"/>
+        <w:sz w:val="16"/>
+        <w:szCs w:val="16"/>
+      </w:rPr>
+      <w:t>Semester  |</w:t>
+    </w:r>
+    <w:proofErr w:type="gramEnd"/>
+    <w:r>
+      <w:rPr>
+        <w:rFonts w:ascii="Arial" w:eastAsia="Arial" w:hAnsi="Arial" w:cs="Arial"/>
+        <w:color w:val="888888"/>
+        <w:sz w:val="16"/>
+        <w:szCs w:val="16"/>
+      </w:rPr>
+      <w:t xml:space="preserve">  Spring 2026</w:t>
     </w:r>
     <w:r>
       <w:rPr>
@@ -4570,7 +7792,17 @@
         <w:sz w:val="16"/>
         <w:szCs w:val="16"/>
       </w:rPr>
-      <w:t>(Software Engineering)</w:t>
+      <w:t xml:space="preserve">(Software </w:t>
+    </w:r>
+    <w:proofErr w:type="gramStart"/>
+    <w:r>
+      <w:rPr>
+        <w:rFonts w:ascii="Arial" w:eastAsia="Arial" w:hAnsi="Arial" w:cs="Arial"/>
+        <w:color w:val="888888"/>
+        <w:sz w:val="16"/>
+        <w:szCs w:val="16"/>
+      </w:rPr>
+      <w:t>Engineering)</w:t>
     </w:r>
     <w:r>
       <w:rPr>
@@ -4579,7 +7811,37 @@
         <w:sz w:val="16"/>
         <w:szCs w:val="16"/>
       </w:rPr>
-      <w:t xml:space="preserve">  |  4th Semester  |  Spring 2026</w:t>
+      <w:t xml:space="preserve">  |</w:t>
+    </w:r>
+    <w:proofErr w:type="gramEnd"/>
+    <w:r>
+      <w:rPr>
+        <w:rFonts w:ascii="Arial" w:eastAsia="Arial" w:hAnsi="Arial" w:cs="Arial"/>
+        <w:color w:val="888888"/>
+        <w:sz w:val="16"/>
+        <w:szCs w:val="16"/>
+      </w:rPr>
+      <w:t xml:space="preserve">  4th </w:t>
+    </w:r>
+    <w:proofErr w:type="gramStart"/>
+    <w:r>
+      <w:rPr>
+        <w:rFonts w:ascii="Arial" w:eastAsia="Arial" w:hAnsi="Arial" w:cs="Arial"/>
+        <w:color w:val="888888"/>
+        <w:sz w:val="16"/>
+        <w:szCs w:val="16"/>
+      </w:rPr>
+      <w:t>Semester  |</w:t>
+    </w:r>
+    <w:proofErr w:type="gramEnd"/>
+    <w:r>
+      <w:rPr>
+        <w:rFonts w:ascii="Arial" w:eastAsia="Arial" w:hAnsi="Arial" w:cs="Arial"/>
+        <w:color w:val="888888"/>
+        <w:sz w:val="16"/>
+        <w:szCs w:val="16"/>
+      </w:rPr>
+      <w:t xml:space="preserve">  Spring 2026</w:t>
     </w:r>
     <w:r>
       <w:rPr>

</xml_diff>